<commit_message>
feat: add three-act zero-data family relay preview
</commit_message>
<xml_diff>
--- a/deliverables/plan/chuan-jia-hua-plan.docx
+++ b/deliverables/plan/chuan-jia-hua-plan.docx
@@ -305,7 +305,7 @@
       <w:r>
         <w:fldChar w:fldCharType="separate"/>
       </w:r>
-      <w:hyperlink w:anchor="_Toc234893804" w:history="1">
+      <w:hyperlink w:anchor="_Toc234900716" w:history="1">
         <w:r>
           <w:rPr>
             <w:rStyle w:val="a9"/>
@@ -332,7 +332,7 @@
             <w:noProof/>
             <w:webHidden/>
           </w:rPr>
-          <w:instrText xml:space="preserve"> PAGEREF _Toc234893804 \h </w:instrText>
+          <w:instrText xml:space="preserve"> PAGEREF _Toc234900716 \h </w:instrText>
         </w:r>
         <w:r>
           <w:rPr>
@@ -376,7 +376,7 @@
           <w14:ligatures w14:val="standardContextual"/>
         </w:rPr>
       </w:pPr>
-      <w:hyperlink w:anchor="_Toc234893805" w:history="1">
+      <w:hyperlink w:anchor="_Toc234900717" w:history="1">
         <w:r>
           <w:rPr>
             <w:rStyle w:val="a9"/>
@@ -403,7 +403,7 @@
             <w:noProof/>
             <w:webHidden/>
           </w:rPr>
-          <w:instrText xml:space="preserve"> PAGEREF _Toc234893805 \h </w:instrText>
+          <w:instrText xml:space="preserve"> PAGEREF _Toc234900717 \h </w:instrText>
         </w:r>
         <w:r>
           <w:rPr>
@@ -447,7 +447,7 @@
           <w14:ligatures w14:val="standardContextual"/>
         </w:rPr>
       </w:pPr>
-      <w:hyperlink w:anchor="_Toc234893806" w:history="1">
+      <w:hyperlink w:anchor="_Toc234900718" w:history="1">
         <w:r>
           <w:rPr>
             <w:rStyle w:val="a9"/>
@@ -474,7 +474,7 @@
             <w:noProof/>
             <w:webHidden/>
           </w:rPr>
-          <w:instrText xml:space="preserve"> PAGEREF _Toc234893806 \h </w:instrText>
+          <w:instrText xml:space="preserve"> PAGEREF _Toc234900718 \h </w:instrText>
         </w:r>
         <w:r>
           <w:rPr>
@@ -518,7 +518,7 @@
           <w14:ligatures w14:val="standardContextual"/>
         </w:rPr>
       </w:pPr>
-      <w:hyperlink w:anchor="_Toc234893807" w:history="1">
+      <w:hyperlink w:anchor="_Toc234900719" w:history="1">
         <w:r>
           <w:rPr>
             <w:rStyle w:val="a9"/>
@@ -545,7 +545,7 @@
             <w:noProof/>
             <w:webHidden/>
           </w:rPr>
-          <w:instrText xml:space="preserve"> PAGEREF _Toc234893807 \h </w:instrText>
+          <w:instrText xml:space="preserve"> PAGEREF _Toc234900719 \h </w:instrText>
         </w:r>
         <w:r>
           <w:rPr>
@@ -589,7 +589,7 @@
           <w14:ligatures w14:val="standardContextual"/>
         </w:rPr>
       </w:pPr>
-      <w:hyperlink w:anchor="_Toc234893808" w:history="1">
+      <w:hyperlink w:anchor="_Toc234900720" w:history="1">
         <w:r>
           <w:rPr>
             <w:rStyle w:val="a9"/>
@@ -616,7 +616,7 @@
             <w:noProof/>
             <w:webHidden/>
           </w:rPr>
-          <w:instrText xml:space="preserve"> PAGEREF _Toc234893808 \h </w:instrText>
+          <w:instrText xml:space="preserve"> PAGEREF _Toc234900720 \h </w:instrText>
         </w:r>
         <w:r>
           <w:rPr>
@@ -660,7 +660,7 @@
           <w14:ligatures w14:val="standardContextual"/>
         </w:rPr>
       </w:pPr>
-      <w:hyperlink w:anchor="_Toc234893809" w:history="1">
+      <w:hyperlink w:anchor="_Toc234900721" w:history="1">
         <w:r>
           <w:rPr>
             <w:rStyle w:val="a9"/>
@@ -687,7 +687,7 @@
             <w:noProof/>
             <w:webHidden/>
           </w:rPr>
-          <w:instrText xml:space="preserve"> PAGEREF _Toc234893809 \h </w:instrText>
+          <w:instrText xml:space="preserve"> PAGEREF _Toc234900721 \h </w:instrText>
         </w:r>
         <w:r>
           <w:rPr>
@@ -731,7 +731,7 @@
           <w14:ligatures w14:val="standardContextual"/>
         </w:rPr>
       </w:pPr>
-      <w:hyperlink w:anchor="_Toc234893810" w:history="1">
+      <w:hyperlink w:anchor="_Toc234900722" w:history="1">
         <w:r>
           <w:rPr>
             <w:rStyle w:val="a9"/>
@@ -758,7 +758,7 @@
             <w:noProof/>
             <w:webHidden/>
           </w:rPr>
-          <w:instrText xml:space="preserve"> PAGEREF _Toc234893810 \h </w:instrText>
+          <w:instrText xml:space="preserve"> PAGEREF _Toc234900722 \h </w:instrText>
         </w:r>
         <w:r>
           <w:rPr>
@@ -802,7 +802,7 @@
           <w14:ligatures w14:val="standardContextual"/>
         </w:rPr>
       </w:pPr>
-      <w:hyperlink w:anchor="_Toc234893811" w:history="1">
+      <w:hyperlink w:anchor="_Toc234900723" w:history="1">
         <w:r>
           <w:rPr>
             <w:rStyle w:val="a9"/>
@@ -829,7 +829,7 @@
             <w:noProof/>
             <w:webHidden/>
           </w:rPr>
-          <w:instrText xml:space="preserve"> PAGEREF _Toc234893811 \h </w:instrText>
+          <w:instrText xml:space="preserve"> PAGEREF _Toc234900723 \h </w:instrText>
         </w:r>
         <w:r>
           <w:rPr>
@@ -873,7 +873,7 @@
           <w14:ligatures w14:val="standardContextual"/>
         </w:rPr>
       </w:pPr>
-      <w:hyperlink w:anchor="_Toc234893812" w:history="1">
+      <w:hyperlink w:anchor="_Toc234900724" w:history="1">
         <w:r>
           <w:rPr>
             <w:rStyle w:val="a9"/>
@@ -900,7 +900,7 @@
             <w:noProof/>
             <w:webHidden/>
           </w:rPr>
-          <w:instrText xml:space="preserve"> PAGEREF _Toc234893812 \h </w:instrText>
+          <w:instrText xml:space="preserve"> PAGEREF _Toc234900724 \h </w:instrText>
         </w:r>
         <w:r>
           <w:rPr>
@@ -944,7 +944,7 @@
           <w14:ligatures w14:val="standardContextual"/>
         </w:rPr>
       </w:pPr>
-      <w:hyperlink w:anchor="_Toc234893813" w:history="1">
+      <w:hyperlink w:anchor="_Toc234900725" w:history="1">
         <w:r>
           <w:rPr>
             <w:rStyle w:val="a9"/>
@@ -971,7 +971,7 @@
             <w:noProof/>
             <w:webHidden/>
           </w:rPr>
-          <w:instrText xml:space="preserve"> PAGEREF _Toc234893813 \h </w:instrText>
+          <w:instrText xml:space="preserve"> PAGEREF _Toc234900725 \h </w:instrText>
         </w:r>
         <w:r>
           <w:rPr>
@@ -1015,7 +1015,7 @@
           <w14:ligatures w14:val="standardContextual"/>
         </w:rPr>
       </w:pPr>
-      <w:hyperlink w:anchor="_Toc234893814" w:history="1">
+      <w:hyperlink w:anchor="_Toc234900726" w:history="1">
         <w:r>
           <w:rPr>
             <w:rStyle w:val="a9"/>
@@ -1042,7 +1042,7 @@
             <w:noProof/>
             <w:webHidden/>
           </w:rPr>
-          <w:instrText xml:space="preserve"> PAGEREF _Toc234893814 \h </w:instrText>
+          <w:instrText xml:space="preserve"> PAGEREF _Toc234900726 \h </w:instrText>
         </w:r>
         <w:r>
           <w:rPr>
@@ -1086,7 +1086,7 @@
           <w14:ligatures w14:val="standardContextual"/>
         </w:rPr>
       </w:pPr>
-      <w:hyperlink w:anchor="_Toc234893815" w:history="1">
+      <w:hyperlink w:anchor="_Toc234900727" w:history="1">
         <w:r>
           <w:rPr>
             <w:rStyle w:val="a9"/>
@@ -1113,7 +1113,7 @@
             <w:noProof/>
             <w:webHidden/>
           </w:rPr>
-          <w:instrText xml:space="preserve"> PAGEREF _Toc234893815 \h </w:instrText>
+          <w:instrText xml:space="preserve"> PAGEREF _Toc234900727 \h </w:instrText>
         </w:r>
         <w:r>
           <w:rPr>
@@ -1157,7 +1157,7 @@
           <w14:ligatures w14:val="standardContextual"/>
         </w:rPr>
       </w:pPr>
-      <w:hyperlink w:anchor="_Toc234893816" w:history="1">
+      <w:hyperlink w:anchor="_Toc234900728" w:history="1">
         <w:r>
           <w:rPr>
             <w:rStyle w:val="a9"/>
@@ -1184,7 +1184,7 @@
             <w:noProof/>
             <w:webHidden/>
           </w:rPr>
-          <w:instrText xml:space="preserve"> PAGEREF _Toc234893816 \h </w:instrText>
+          <w:instrText xml:space="preserve"> PAGEREF _Toc234900728 \h </w:instrText>
         </w:r>
         <w:r>
           <w:rPr>
@@ -1228,7 +1228,7 @@
           <w14:ligatures w14:val="standardContextual"/>
         </w:rPr>
       </w:pPr>
-      <w:hyperlink w:anchor="_Toc234893817" w:history="1">
+      <w:hyperlink w:anchor="_Toc234900729" w:history="1">
         <w:r>
           <w:rPr>
             <w:rStyle w:val="a9"/>
@@ -1255,7 +1255,7 @@
             <w:noProof/>
             <w:webHidden/>
           </w:rPr>
-          <w:instrText xml:space="preserve"> PAGEREF _Toc234893817 \h </w:instrText>
+          <w:instrText xml:space="preserve"> PAGEREF _Toc234900729 \h </w:instrText>
         </w:r>
         <w:r>
           <w:rPr>
@@ -1299,7 +1299,7 @@
           <w14:ligatures w14:val="standardContextual"/>
         </w:rPr>
       </w:pPr>
-      <w:hyperlink w:anchor="_Toc234893818" w:history="1">
+      <w:hyperlink w:anchor="_Toc234900730" w:history="1">
         <w:r>
           <w:rPr>
             <w:rStyle w:val="a9"/>
@@ -1326,7 +1326,7 @@
             <w:noProof/>
             <w:webHidden/>
           </w:rPr>
-          <w:instrText xml:space="preserve"> PAGEREF _Toc234893818 \h </w:instrText>
+          <w:instrText xml:space="preserve"> PAGEREF _Toc234900730 \h </w:instrText>
         </w:r>
         <w:r>
           <w:rPr>
@@ -1370,7 +1370,7 @@
           <w14:ligatures w14:val="standardContextual"/>
         </w:rPr>
       </w:pPr>
-      <w:hyperlink w:anchor="_Toc234893819" w:history="1">
+      <w:hyperlink w:anchor="_Toc234900731" w:history="1">
         <w:r>
           <w:rPr>
             <w:rStyle w:val="a9"/>
@@ -1397,7 +1397,7 @@
             <w:noProof/>
             <w:webHidden/>
           </w:rPr>
-          <w:instrText xml:space="preserve"> PAGEREF _Toc234893819 \h </w:instrText>
+          <w:instrText xml:space="preserve"> PAGEREF _Toc234900731 \h </w:instrText>
         </w:r>
         <w:r>
           <w:rPr>
@@ -1441,7 +1441,7 @@
           <w14:ligatures w14:val="standardContextual"/>
         </w:rPr>
       </w:pPr>
-      <w:hyperlink w:anchor="_Toc234893820" w:history="1">
+      <w:hyperlink w:anchor="_Toc234900732" w:history="1">
         <w:r>
           <w:rPr>
             <w:rStyle w:val="a9"/>
@@ -1468,7 +1468,7 @@
             <w:noProof/>
             <w:webHidden/>
           </w:rPr>
-          <w:instrText xml:space="preserve"> PAGEREF _Toc234893820 \h </w:instrText>
+          <w:instrText xml:space="preserve"> PAGEREF _Toc234900732 \h </w:instrText>
         </w:r>
         <w:r>
           <w:rPr>
@@ -1512,7 +1512,7 @@
           <w14:ligatures w14:val="standardContextual"/>
         </w:rPr>
       </w:pPr>
-      <w:hyperlink w:anchor="_Toc234893821" w:history="1">
+      <w:hyperlink w:anchor="_Toc234900733" w:history="1">
         <w:r>
           <w:rPr>
             <w:rStyle w:val="a9"/>
@@ -1539,7 +1539,7 @@
             <w:noProof/>
             <w:webHidden/>
           </w:rPr>
-          <w:instrText xml:space="preserve"> PAGEREF _Toc234893821 \h </w:instrText>
+          <w:instrText xml:space="preserve"> PAGEREF _Toc234900733 \h </w:instrText>
         </w:r>
         <w:r>
           <w:rPr>
@@ -1583,7 +1583,7 @@
           <w14:ligatures w14:val="standardContextual"/>
         </w:rPr>
       </w:pPr>
-      <w:hyperlink w:anchor="_Toc234893822" w:history="1">
+      <w:hyperlink w:anchor="_Toc234900734" w:history="1">
         <w:r>
           <w:rPr>
             <w:rStyle w:val="a9"/>
@@ -1610,7 +1610,7 @@
             <w:noProof/>
             <w:webHidden/>
           </w:rPr>
-          <w:instrText xml:space="preserve"> PAGEREF _Toc234893822 \h </w:instrText>
+          <w:instrText xml:space="preserve"> PAGEREF _Toc234900734 \h </w:instrText>
         </w:r>
         <w:r>
           <w:rPr>
@@ -1654,7 +1654,7 @@
           <w14:ligatures w14:val="standardContextual"/>
         </w:rPr>
       </w:pPr>
-      <w:hyperlink w:anchor="_Toc234893823" w:history="1">
+      <w:hyperlink w:anchor="_Toc234900735" w:history="1">
         <w:r>
           <w:rPr>
             <w:rStyle w:val="a9"/>
@@ -1681,7 +1681,7 @@
             <w:noProof/>
             <w:webHidden/>
           </w:rPr>
-          <w:instrText xml:space="preserve"> PAGEREF _Toc234893823 \h </w:instrText>
+          <w:instrText xml:space="preserve"> PAGEREF _Toc234900735 \h </w:instrText>
         </w:r>
         <w:r>
           <w:rPr>
@@ -1725,7 +1725,7 @@
           <w14:ligatures w14:val="standardContextual"/>
         </w:rPr>
       </w:pPr>
-      <w:hyperlink w:anchor="_Toc234893824" w:history="1">
+      <w:hyperlink w:anchor="_Toc234900736" w:history="1">
         <w:r>
           <w:rPr>
             <w:rStyle w:val="a9"/>
@@ -1752,7 +1752,7 @@
             <w:noProof/>
             <w:webHidden/>
           </w:rPr>
-          <w:instrText xml:space="preserve"> PAGEREF _Toc234893824 \h </w:instrText>
+          <w:instrText xml:space="preserve"> PAGEREF _Toc234900736 \h </w:instrText>
         </w:r>
         <w:r>
           <w:rPr>
@@ -1796,7 +1796,7 @@
           <w14:ligatures w14:val="standardContextual"/>
         </w:rPr>
       </w:pPr>
-      <w:hyperlink w:anchor="_Toc234893825" w:history="1">
+      <w:hyperlink w:anchor="_Toc234900737" w:history="1">
         <w:r>
           <w:rPr>
             <w:rStyle w:val="a9"/>
@@ -1823,7 +1823,7 @@
             <w:noProof/>
             <w:webHidden/>
           </w:rPr>
-          <w:instrText xml:space="preserve"> PAGEREF _Toc234893825 \h </w:instrText>
+          <w:instrText xml:space="preserve"> PAGEREF _Toc234900737 \h </w:instrText>
         </w:r>
         <w:r>
           <w:rPr>
@@ -1867,7 +1867,7 @@
           <w14:ligatures w14:val="standardContextual"/>
         </w:rPr>
       </w:pPr>
-      <w:hyperlink w:anchor="_Toc234893826" w:history="1">
+      <w:hyperlink w:anchor="_Toc234900738" w:history="1">
         <w:r>
           <w:rPr>
             <w:rStyle w:val="a9"/>
@@ -1894,7 +1894,7 @@
             <w:noProof/>
             <w:webHidden/>
           </w:rPr>
-          <w:instrText xml:space="preserve"> PAGEREF _Toc234893826 \h </w:instrText>
+          <w:instrText xml:space="preserve"> PAGEREF _Toc234900738 \h </w:instrText>
         </w:r>
         <w:r>
           <w:rPr>
@@ -1938,7 +1938,7 @@
           <w14:ligatures w14:val="standardContextual"/>
         </w:rPr>
       </w:pPr>
-      <w:hyperlink w:anchor="_Toc234893827" w:history="1">
+      <w:hyperlink w:anchor="_Toc234900739" w:history="1">
         <w:r>
           <w:rPr>
             <w:rStyle w:val="a9"/>
@@ -1965,7 +1965,7 @@
             <w:noProof/>
             <w:webHidden/>
           </w:rPr>
-          <w:instrText xml:space="preserve"> PAGEREF _Toc234893827 \h </w:instrText>
+          <w:instrText xml:space="preserve"> PAGEREF _Toc234900739 \h </w:instrText>
         </w:r>
         <w:r>
           <w:rPr>
@@ -2009,7 +2009,7 @@
           <w14:ligatures w14:val="standardContextual"/>
         </w:rPr>
       </w:pPr>
-      <w:hyperlink w:anchor="_Toc234893828" w:history="1">
+      <w:hyperlink w:anchor="_Toc234900740" w:history="1">
         <w:r>
           <w:rPr>
             <w:rStyle w:val="a9"/>
@@ -2036,7 +2036,7 @@
             <w:noProof/>
             <w:webHidden/>
           </w:rPr>
-          <w:instrText xml:space="preserve"> PAGEREF _Toc234893828 \h </w:instrText>
+          <w:instrText xml:space="preserve"> PAGEREF _Toc234900740 \h </w:instrText>
         </w:r>
         <w:r>
           <w:rPr>
@@ -2056,7 +2056,7 @@
             <w:noProof/>
             <w:webHidden/>
           </w:rPr>
-          <w:t>14</w:t>
+          <w:t>15</w:t>
         </w:r>
         <w:r>
           <w:rPr>
@@ -2080,7 +2080,7 @@
           <w14:ligatures w14:val="standardContextual"/>
         </w:rPr>
       </w:pPr>
-      <w:hyperlink w:anchor="_Toc234893829" w:history="1">
+      <w:hyperlink w:anchor="_Toc234900741" w:history="1">
         <w:r>
           <w:rPr>
             <w:rStyle w:val="a9"/>
@@ -2107,7 +2107,7 @@
             <w:noProof/>
             <w:webHidden/>
           </w:rPr>
-          <w:instrText xml:space="preserve"> PAGEREF _Toc234893829 \h </w:instrText>
+          <w:instrText xml:space="preserve"> PAGEREF _Toc234900741 \h </w:instrText>
         </w:r>
         <w:r>
           <w:rPr>
@@ -2151,7 +2151,7 @@
           <w14:ligatures w14:val="standardContextual"/>
         </w:rPr>
       </w:pPr>
-      <w:hyperlink w:anchor="_Toc234893830" w:history="1">
+      <w:hyperlink w:anchor="_Toc234900742" w:history="1">
         <w:r>
           <w:rPr>
             <w:rStyle w:val="a9"/>
@@ -2178,7 +2178,7 @@
             <w:noProof/>
             <w:webHidden/>
           </w:rPr>
-          <w:instrText xml:space="preserve"> PAGEREF _Toc234893830 \h </w:instrText>
+          <w:instrText xml:space="preserve"> PAGEREF _Toc234900742 \h </w:instrText>
         </w:r>
         <w:r>
           <w:rPr>
@@ -2222,7 +2222,7 @@
           <w14:ligatures w14:val="standardContextual"/>
         </w:rPr>
       </w:pPr>
-      <w:hyperlink w:anchor="_Toc234893831" w:history="1">
+      <w:hyperlink w:anchor="_Toc234900743" w:history="1">
         <w:r>
           <w:rPr>
             <w:rStyle w:val="a9"/>
@@ -2249,7 +2249,7 @@
             <w:noProof/>
             <w:webHidden/>
           </w:rPr>
-          <w:instrText xml:space="preserve"> PAGEREF _Toc234893831 \h </w:instrText>
+          <w:instrText xml:space="preserve"> PAGEREF _Toc234900743 \h </w:instrText>
         </w:r>
         <w:r>
           <w:rPr>
@@ -2293,7 +2293,7 @@
           <w14:ligatures w14:val="standardContextual"/>
         </w:rPr>
       </w:pPr>
-      <w:hyperlink w:anchor="_Toc234893832" w:history="1">
+      <w:hyperlink w:anchor="_Toc234900744" w:history="1">
         <w:r>
           <w:rPr>
             <w:rStyle w:val="a9"/>
@@ -2320,7 +2320,7 @@
             <w:noProof/>
             <w:webHidden/>
           </w:rPr>
-          <w:instrText xml:space="preserve"> PAGEREF _Toc234893832 \h </w:instrText>
+          <w:instrText xml:space="preserve"> PAGEREF _Toc234900744 \h </w:instrText>
         </w:r>
         <w:r>
           <w:rPr>
@@ -2364,7 +2364,7 @@
           <w14:ligatures w14:val="standardContextual"/>
         </w:rPr>
       </w:pPr>
-      <w:hyperlink w:anchor="_Toc234893833" w:history="1">
+      <w:hyperlink w:anchor="_Toc234900745" w:history="1">
         <w:r>
           <w:rPr>
             <w:rStyle w:val="a9"/>
@@ -2391,7 +2391,7 @@
             <w:noProof/>
             <w:webHidden/>
           </w:rPr>
-          <w:instrText xml:space="preserve"> PAGEREF _Toc234893833 \h </w:instrText>
+          <w:instrText xml:space="preserve"> PAGEREF _Toc234900745 \h </w:instrText>
         </w:r>
         <w:r>
           <w:rPr>
@@ -2434,7 +2434,7 @@
       <w:pPr>
         <w:pStyle w:val="HTH1"/>
       </w:pPr>
-      <w:bookmarkStart w:id="0" w:name="_Toc234893804"/>
+      <w:bookmarkStart w:id="0" w:name="_Toc234900716"/>
       <w:r>
         <w:lastRenderedPageBreak/>
         <w:t>第一章　緣起（構想）</w:t>
@@ -2445,7 +2445,7 @@
       <w:pPr>
         <w:pStyle w:val="HTH2"/>
       </w:pPr>
-      <w:bookmarkStart w:id="1" w:name="_Toc234893805"/>
+      <w:bookmarkStart w:id="1" w:name="_Toc234900717"/>
       <w:r>
         <w:t>一、從「有教材」走到「孩子真的回一句」</w:t>
       </w:r>
@@ -2522,7 +2522,7 @@
       <w:pPr>
         <w:pStyle w:val="HTH2"/>
       </w:pPr>
-      <w:bookmarkStart w:id="2" w:name="_Toc234893806"/>
+      <w:bookmarkStart w:id="2" w:name="_Toc234900718"/>
       <w:r>
         <w:t>二、把短句放進會改變的家庭故事</w:t>
       </w:r>
@@ -2541,13 +2541,31 @@
         <w:pStyle w:val="HTBody"/>
       </w:pPr>
       <w:r>
-        <w:t>首頁先把最小價值單位交到家庭手上：不用填資料即可進入</w:t>
+        <w:t>首頁先把最小價值單位交到家庭手上：不用填資料即可進入約</w:t>
       </w:r>
       <w:r>
         <w:t>30</w:t>
       </w:r>
       <w:r>
-        <w:t>秒試演，明確點播長輩的一句話、選一個中文意思，舞台便立刻出現不同結果；試演不錄音、不儲存，也不要求先建立家庭。完整體驗再把練習展開成</w:t>
+        <w:t>秒三幕試演。第一幕明確點播長輩的一句話，第二幕選一個中文意思並立刻看見舞台改變，第三幕直接看見「孩子帶回</w:t>
+      </w:r>
+      <w:r>
+        <w:t>—</w:t>
+      </w:r>
+      <w:r>
+        <w:t>家人傳下</w:t>
+      </w:r>
+      <w:r>
+        <w:t>—</w:t>
+      </w:r>
+      <w:r>
+        <w:t>孩子接住」的三棒作品原理。試演使用固定</w:t>
+      </w:r>
+      <w:r>
+        <w:t>Piper</w:t>
+      </w:r>
+      <w:r>
+        <w:t>合成示範並明示不是真人原音、尚非母語審閱成果；全程不錄音、不儲存、不建立家庭、故事、接力或作答資料。完整體驗再把練習展開成</w:t>
       </w:r>
       <w:r>
         <w:t>60</w:t>
@@ -2566,7 +2584,7 @@
       <w:pPr>
         <w:pStyle w:val="HTH2"/>
       </w:pPr>
-      <w:bookmarkStart w:id="3" w:name="_Toc234893807"/>
+      <w:bookmarkStart w:id="3" w:name="_Toc234900719"/>
       <w:r>
         <w:t>三、服務對象與第一階段範圍</w:t>
       </w:r>
@@ -2604,7 +2622,7 @@
       <w:pPr>
         <w:pStyle w:val="HTH2"/>
       </w:pPr>
-      <w:bookmarkStart w:id="4" w:name="_Toc234893808"/>
+      <w:bookmarkStart w:id="4" w:name="_Toc234900720"/>
       <w:r>
         <w:lastRenderedPageBreak/>
         <w:t>四、政策與社會意義</w:t>
@@ -2780,7 +2798,7 @@
           <w:noProof/>
         </w:rPr>
         <w:drawing>
-          <wp:inline distT="0" distB="0" distL="0" distR="0" wp14:anchorId="0E3684C8" wp14:editId="5C909B8F">
+          <wp:inline distT="0" distB="0" distL="0" distR="0" wp14:anchorId="4C5CB7B3" wp14:editId="1C0033EF">
             <wp:extent cx="5220000" cy="2947765"/>
             <wp:effectExtent l="0" t="0" r="0" b="0"/>
             <wp:docPr id="1" name="Picture 1"/>
@@ -2840,7 +2858,7 @@
       <w:pPr>
         <w:pStyle w:val="HTH1"/>
       </w:pPr>
-      <w:bookmarkStart w:id="5" w:name="_Toc234893809"/>
+      <w:bookmarkStart w:id="5" w:name="_Toc234900721"/>
       <w:r>
         <w:lastRenderedPageBreak/>
         <w:t>第二章　作品功能介紹</w:t>
@@ -2851,7 +2869,7 @@
       <w:pPr>
         <w:pStyle w:val="HTH2"/>
       </w:pPr>
-      <w:bookmarkStart w:id="6" w:name="_Toc234893810"/>
+      <w:bookmarkStart w:id="6" w:name="_Toc234900722"/>
       <w:r>
         <w:t>一、五個生活舞台，角色先陪孩子演</w:t>
       </w:r>
@@ -2877,7 +2895,7 @@
       <w:pPr>
         <w:pStyle w:val="HTH2"/>
       </w:pPr>
-      <w:bookmarkStart w:id="7" w:name="_Toc234893811"/>
+      <w:bookmarkStart w:id="7" w:name="_Toc234900723"/>
       <w:r>
         <w:t>二、零基礎孩子先懂意思，再聽、再說</w:t>
       </w:r>
@@ -2909,7 +2927,7 @@
       <w:pPr>
         <w:pStyle w:val="HTH2"/>
       </w:pPr>
-      <w:bookmarkStart w:id="8" w:name="_Toc234893812"/>
+      <w:bookmarkStart w:id="8" w:name="_Toc234900724"/>
       <w:r>
         <w:t>三、每一次回話都讓舞台往前走</w:t>
       </w:r>
@@ -2935,7 +2953,7 @@
       <w:pPr>
         <w:pStyle w:val="HTH2"/>
       </w:pPr>
-      <w:bookmarkStart w:id="9" w:name="_Toc234893813"/>
+      <w:bookmarkStart w:id="9" w:name="_Toc234900725"/>
       <w:r>
         <w:t>四、真人家人有空時再加戲</w:t>
       </w:r>
@@ -2961,7 +2979,7 @@
       <w:pPr>
         <w:pStyle w:val="HTH2"/>
       </w:pPr>
-      <w:bookmarkStart w:id="10" w:name="_Toc234893814"/>
+      <w:bookmarkStart w:id="10" w:name="_Toc234900726"/>
       <w:r>
         <w:lastRenderedPageBreak/>
         <w:t>五、孩子與成人權限分開</w:t>
@@ -3013,7 +3031,7 @@
           <w:noProof/>
         </w:rPr>
         <w:drawing>
-          <wp:inline distT="0" distB="0" distL="0" distR="0" wp14:anchorId="32ACB1EA" wp14:editId="2632263E">
+          <wp:inline distT="0" distB="0" distL="0" distR="0" wp14:anchorId="4ED50C80" wp14:editId="5E4D5893">
             <wp:extent cx="5220000" cy="2763529"/>
             <wp:effectExtent l="0" t="0" r="0" b="0"/>
             <wp:docPr id="2" name="Picture 2"/>
@@ -3067,7 +3085,7 @@
       <w:pPr>
         <w:pStyle w:val="HTH2"/>
       </w:pPr>
-      <w:bookmarkStart w:id="11" w:name="_Toc234893815"/>
+      <w:bookmarkStart w:id="11" w:name="_Toc234900727"/>
       <w:r>
         <w:t>六、課堂主題與家庭內容分層</w:t>
       </w:r>
@@ -3093,7 +3111,7 @@
       <w:pPr>
         <w:pStyle w:val="HTH2"/>
       </w:pPr>
-      <w:bookmarkStart w:id="12" w:name="_Toc234893816"/>
+      <w:bookmarkStart w:id="12" w:name="_Toc234900728"/>
       <w:r>
         <w:lastRenderedPageBreak/>
         <w:t>七、五個競賽版已實作的故事種子</w:t>
@@ -3213,7 +3231,7 @@
       <w:pPr>
         <w:pStyle w:val="HTH2"/>
       </w:pPr>
-      <w:bookmarkStart w:id="13" w:name="_Toc234893817"/>
+      <w:bookmarkStart w:id="13" w:name="_Toc234900729"/>
       <w:r>
         <w:t>八、教育機會情報站（競賽版已完成官方入口）</w:t>
       </w:r>
@@ -3437,7 +3455,7 @@
       <w:pPr>
         <w:pStyle w:val="HTH1"/>
       </w:pPr>
-      <w:bookmarkStart w:id="14" w:name="_Toc234893818"/>
+      <w:bookmarkStart w:id="14" w:name="_Toc234900730"/>
       <w:r>
         <w:t>第三章　作品摘要</w:t>
       </w:r>
@@ -3447,7 +3465,7 @@
       <w:pPr>
         <w:pStyle w:val="HTH2"/>
       </w:pPr>
-      <w:bookmarkStart w:id="15" w:name="_Toc234893819"/>
+      <w:bookmarkStart w:id="15" w:name="_Toc234900731"/>
       <w:r>
         <w:t>一、作品橫跨領域項目</w:t>
       </w:r>
@@ -3465,7 +3483,7 @@
       <w:pPr>
         <w:pStyle w:val="HTH2"/>
       </w:pPr>
-      <w:bookmarkStart w:id="16" w:name="_Toc234893820"/>
+      <w:bookmarkStart w:id="16" w:name="_Toc234900732"/>
       <w:r>
         <w:t>二、作品應用類型與範圍</w:t>
       </w:r>
@@ -3482,7 +3500,19 @@
         <w:t>Flutter Web</w:t>
       </w:r>
       <w:r>
-        <w:t>原型。評審可從家庭同意與角色設定開始，走完一集三幕分支、故事卡、家人回應與家庭版本錄音，也可查看另四集生活故事；「選故事」頁首另可完成五類日常家庭接力、四關任務、三棒作品與故事護照，以及</w:t>
+        <w:t>原型。評審可先用三次主要操作走完零資料試演的「聽一句</w:t>
+      </w:r>
+      <w:r>
+        <w:t>—</w:t>
+      </w:r>
+      <w:r>
+        <w:t>舞台改變</w:t>
+      </w:r>
+      <w:r>
+        <w:t>—</w:t>
+      </w:r>
+      <w:r>
+        <w:t>三棒揭示」，再從家庭同意與角色設定開始，走完一集三幕分支、故事卡、家人回應與家庭版本錄音，也可查看另四集生活故事；「選故事」頁首另可完成五類日常家庭接力、四關任務、三棒作品與故事護照，以及</w:t>
       </w:r>
       <w:r>
         <w:t>3</w:t>
@@ -3557,7 +3587,7 @@
       <w:pPr>
         <w:pStyle w:val="HTH2"/>
       </w:pPr>
-      <w:bookmarkStart w:id="17" w:name="_Toc234893821"/>
+      <w:bookmarkStart w:id="17" w:name="_Toc234900733"/>
       <w:r>
         <w:t>三、特性與設計重點</w:t>
       </w:r>
@@ -3606,17 +3636,6 @@
       </w:r>
       <w:r>
         <w:t>，第一次由使用者明確點播。</w:t>
-      </w:r>
-    </w:p>
-    <w:p>
-      <w:pPr>
-        <w:pStyle w:val="HTBullet"/>
-      </w:pPr>
-      <w:r>
-        <w:t xml:space="preserve">• </w:t>
-      </w:r>
-      <w:r>
-        <w:t>分支有可見後果：角色回話、場景與第三幕都保留先前選擇。</w:t>
       </w:r>
     </w:p>
     <w:p>
@@ -3628,6 +3647,17 @@
         <w:t xml:space="preserve">• </w:t>
       </w:r>
       <w:r>
+        <w:t>分支有可見後果：角色回話、場景與第三幕都保留先前選擇。</w:t>
+      </w:r>
+    </w:p>
+    <w:p>
+      <w:pPr>
+        <w:pStyle w:val="HTBullet"/>
+      </w:pPr>
+      <w:r>
+        <w:t xml:space="preserve">• </w:t>
+      </w:r>
+      <w:r>
         <w:t>語音不是評分器：只顯示裝置聽到什麼；失敗時用小卡繼續。</w:t>
       </w:r>
     </w:p>
@@ -3707,7 +3737,7 @@
       <w:pPr>
         <w:pStyle w:val="HTH2"/>
       </w:pPr>
-      <w:bookmarkStart w:id="18" w:name="_Toc234893822"/>
+      <w:bookmarkStart w:id="18" w:name="_Toc234900734"/>
       <w:r>
         <w:t>四、應用專業技術說明</w:t>
       </w:r>
@@ -3857,7 +3887,7 @@
         </w:rPr>
         <w:lastRenderedPageBreak/>
         <w:drawing>
-          <wp:inline distT="0" distB="0" distL="0" distR="0" wp14:anchorId="6CF1CFE5" wp14:editId="13C166F3">
+          <wp:inline distT="0" distB="0" distL="0" distR="0" wp14:anchorId="584BE395" wp14:editId="72669F58">
             <wp:extent cx="5220000" cy="3009176"/>
             <wp:effectExtent l="0" t="0" r="0" b="0"/>
             <wp:docPr id="3" name="Picture 3"/>
@@ -3911,7 +3941,7 @@
       <w:pPr>
         <w:pStyle w:val="HTH2"/>
       </w:pPr>
-      <w:bookmarkStart w:id="19" w:name="_Toc234893823"/>
+      <w:bookmarkStart w:id="19" w:name="_Toc234900735"/>
       <w:r>
         <w:t>五、創意及原創性說明</w:t>
       </w:r>
@@ -4507,7 +4537,7 @@
       <w:pPr>
         <w:pStyle w:val="HTH2"/>
       </w:pPr>
-      <w:bookmarkStart w:id="20" w:name="_Toc234893824"/>
+      <w:bookmarkStart w:id="20" w:name="_Toc234900736"/>
       <w:r>
         <w:t>六、市場潛力說明</w:t>
       </w:r>
@@ -5234,7 +5264,7 @@
       <w:pPr>
         <w:pStyle w:val="HTH1"/>
       </w:pPr>
-      <w:bookmarkStart w:id="21" w:name="_Toc234893825"/>
+      <w:bookmarkStart w:id="21" w:name="_Toc234900737"/>
       <w:r>
         <w:t>第四章　操作方法</w:t>
       </w:r>
@@ -5244,7 +5274,7 @@
       <w:pPr>
         <w:pStyle w:val="HTH2"/>
       </w:pPr>
-      <w:bookmarkStart w:id="22" w:name="_Toc234893826"/>
+      <w:bookmarkStart w:id="22" w:name="_Toc234900738"/>
       <w:r>
         <w:t>一、評審可操作的完整流程</w:t>
       </w:r>
@@ -5264,13 +5294,13 @@
         <w:t>Web</w:t>
       </w:r>
       <w:r>
-        <w:t>版可先點「先試演</w:t>
+        <w:t>版先點「先試演約</w:t>
       </w:r>
       <w:r>
         <w:t>30</w:t>
       </w:r>
       <w:r>
-        <w:t>秒」完成一個不錄音、不儲存的分支；返回後閱讀家庭資料與錄音說明，勾選兩項同意、設定四位數家長碼，再由成人輸入長輩稱呼與孩子小名。</w:t>
+        <w:t>秒」，依序看見長輩開場、孩子選句後的舞台變化，以及固定合成的三棒接力預演；畫面明示未使用家庭資料、不是真人原音且不代表母語審閱完成。退出前後故事、接力與作答資料皆不變。返回後再閱讀家庭資料與錄音說明，勾選兩項同意、設定四位數家長碼，並由成人輸入長輩稱呼與孩子小名。</w:t>
       </w:r>
     </w:p>
     <w:p>
@@ -5333,6 +5363,7 @@
         <w:pStyle w:val="HTNumbered"/>
       </w:pPr>
       <w:r>
+        <w:lastRenderedPageBreak/>
         <w:t xml:space="preserve">7. </w:t>
       </w:r>
       <w:r>
@@ -5344,7 +5375,6 @@
         <w:pStyle w:val="HTNumbered"/>
       </w:pPr>
       <w:r>
-        <w:lastRenderedPageBreak/>
         <w:t xml:space="preserve">8. </w:t>
       </w:r>
       <w:r>
@@ -5391,7 +5421,7 @@
           <w:noProof/>
         </w:rPr>
         <w:drawing>
-          <wp:inline distT="0" distB="0" distL="0" distR="0" wp14:anchorId="7D973B56" wp14:editId="2DCC41E3">
+          <wp:inline distT="0" distB="0" distL="0" distR="0" wp14:anchorId="65FBF977" wp14:editId="0E9E25DF">
             <wp:extent cx="5220000" cy="3132000"/>
             <wp:effectExtent l="0" t="0" r="0" b="0"/>
             <wp:docPr id="4" name="Picture 4"/>
@@ -5444,14 +5474,14 @@
         <w:t>Edge Pixel 7</w:t>
       </w:r>
       <w:r>
-        <w:t>流程實際擷取：五個日常題材、社團接力交接、三棒家庭作品與教育機會情報，均來自目前交付版。</w:t>
+        <w:t>流程實際擷取：零資料三棒預演、社團接力交接、實際三棒家庭作品與教育機會情報，均來自目前交付版。</w:t>
       </w:r>
     </w:p>
     <w:p>
       <w:pPr>
         <w:pStyle w:val="HTH2"/>
       </w:pPr>
-      <w:bookmarkStart w:id="23" w:name="_Toc234893827"/>
+      <w:bookmarkStart w:id="23" w:name="_Toc234900739"/>
       <w:r>
         <w:t>二、使用與運作方式</w:t>
       </w:r>
@@ -5507,8 +5537,9 @@
       <w:pPr>
         <w:pStyle w:val="HTH2"/>
       </w:pPr>
-      <w:bookmarkStart w:id="24" w:name="_Toc234893828"/>
-      <w:r>
+      <w:bookmarkStart w:id="24" w:name="_Toc234900740"/>
+      <w:r>
+        <w:lastRenderedPageBreak/>
         <w:t>三、目前成果與推進規劃</w:t>
       </w:r>
       <w:bookmarkEnd w:id="24"/>
@@ -5518,35 +5549,727 @@
         <w:pStyle w:val="HTBody"/>
       </w:pPr>
       <w:r>
-        <w:t>目前已完成五集三幕分支、零基礎聽句鷹架、正常／慢速／逐段播放、麥克風與小卡備援、家庭故事卡、真人家人逐節點原音、家人留言／表情、成人分流、一次性邀請及本機資料管理。「選故事」另已完成五類家庭接力、四關任務、三</w:t>
-      </w:r>
+        <w:t>目前已完成五集三幕分支、零基礎聽句鷹架、正常／慢速／逐段播放、麥克風與小卡備援、家庭故事卡、真人家人逐節點原音、家人留言／表情、成人分流、一次性邀請及本機資料管理。「選故事」另已完成五類家庭接力、四關任務、三棒作品、家人圈重播與故事護照，以及</w:t>
+      </w:r>
+      <w:r>
+        <w:t>3</w:t>
+      </w:r>
+      <w:r>
+        <w:t>筆官方資訊與本機延伸入口；五類接力不列為完成劇集。現行</w:t>
+      </w:r>
+      <w:r>
+        <w:t>119</w:t>
+      </w:r>
+      <w:r>
+        <w:t>個引用音檔有單一可追溯來源與逐檔</w:t>
+      </w:r>
+      <w:r>
+        <w:t>manifest</w:t>
+      </w:r>
+      <w:r>
+        <w:t>，教師端另有</w:t>
+      </w:r>
+      <w:r>
+        <w:t>19</w:t>
+      </w:r>
+      <w:r>
+        <w:t>頁四週試辦包。</w:t>
+      </w:r>
+    </w:p>
+    <w:p>
+      <w:pPr>
+        <w:pStyle w:val="HTBody"/>
+      </w:pPr>
+      <w:r>
+        <w:t>本次變更後的工程驗證為</w:t>
+      </w:r>
+      <w:r>
+        <w:t>Flutter</w:t>
+      </w:r>
+      <w:r>
+        <w:t>靜態分析</w:t>
+      </w:r>
+      <w:r>
+        <w:t>0</w:t>
+      </w:r>
+      <w:r>
+        <w:t>問題、</w:t>
+      </w:r>
+      <w:r>
+        <w:t>Flutter</w:t>
+      </w:r>
+      <w:r>
+        <w:t>測試</w:t>
+      </w:r>
+      <w:r>
+        <w:t>134</w:t>
+      </w:r>
+      <w:r>
+        <w:t>／</w:t>
+      </w:r>
+      <w:r>
+        <w:t>134</w:t>
+      </w:r>
+      <w:r>
+        <w:t>、相對路徑</w:t>
+      </w:r>
+      <w:r>
+        <w:t>Web build</w:t>
+      </w:r>
+      <w:r>
+        <w:t>與完整品質閘門通過；來源版的</w:t>
+      </w:r>
+      <w:r>
+        <w:t>Chromium</w:t>
+      </w:r>
+      <w:r>
+        <w:t>與</w:t>
+      </w:r>
+      <w:r>
+        <w:t>Edge</w:t>
+      </w:r>
+      <w:r>
+        <w:t>均實走零資料三幕試演，包含第三幕合成音訊明確點擊、三棒揭示與回到同意頁。完整</w:t>
+      </w:r>
+      <w:r>
+        <w:t>7</w:t>
+      </w:r>
+      <w:r>
+        <w:t>／</w:t>
+      </w:r>
+      <w:r>
+        <w:t>7</w:t>
+      </w:r>
+      <w:r>
+        <w:t>回歸另涵蓋</w:t>
+      </w:r>
+      <w:r>
+        <w:t>Pixel 7 viewport</w:t>
+      </w:r>
+      <w:r>
+        <w:t>視覺</w:t>
+      </w:r>
+      <w:r>
+        <w:t>2</w:t>
+      </w:r>
+      <w:r>
+        <w:t>／</w:t>
+      </w:r>
+      <w:r>
+        <w:t>2</w:t>
+      </w:r>
+      <w:r>
+        <w:t>與</w:t>
+      </w:r>
+      <w:r>
+        <w:t>Web</w:t>
+      </w:r>
+      <w:r>
+        <w:t>行為</w:t>
+      </w:r>
+      <w:r>
+        <w:t>5</w:t>
+      </w:r>
+      <w:r>
+        <w:t>／</w:t>
+      </w:r>
+      <w:r>
+        <w:t>5</w:t>
+      </w:r>
+      <w:r>
+        <w:t>；首句音訊案例要求同一次明確點擊取得</w:t>
+      </w:r>
+      <w:r>
+        <w:t>MP3 HTTP 200</w:t>
+      </w:r>
+      <w:r>
+        <w:t>，並觀察</w:t>
+      </w:r>
+      <w:r>
+        <w:t>play</w:t>
+      </w:r>
+      <w:r>
+        <w:t>、</w:t>
+      </w:r>
+      <w:r>
+        <w:t>playing</w:t>
+      </w:r>
+      <w:r>
+        <w:t>與</w:t>
+      </w:r>
+      <w:r>
+        <w:t>ended</w:t>
+      </w:r>
+      <w:r>
+        <w:t>且無</w:t>
+      </w:r>
+      <w:r>
+        <w:t>error</w:t>
+      </w:r>
+      <w:r>
+        <w:t>。</w:t>
+      </w:r>
+      <w:r>
+        <w:t>Pixel 7</w:t>
+      </w:r>
+      <w:r>
+        <w:t>只是瀏覽器</w:t>
+      </w:r>
+      <w:r>
+        <w:t>viewport</w:t>
+      </w:r>
+      <w:r>
+        <w:t>，不是真機。工程測試證明狀態、路徑與失敗修復，不證明孩子看得懂、越南語自然或家庭會長期使用。</w:t>
+      </w:r>
+    </w:p>
+    <w:p>
+      <w:pPr>
+        <w:pStyle w:val="HTBody"/>
+      </w:pPr>
+      <w:r>
+        <w:t>送件前優先完成四件事：一、由越南語母語者逐句複聽</w:t>
+      </w:r>
+      <w:r>
+        <w:t>119</w:t>
+      </w:r>
+      <w:r>
+        <w:t>檔並留下修訂紀錄；二、以</w:t>
+      </w:r>
+      <w:r>
+        <w:t>3</w:t>
+      </w:r>
+      <w:r>
+        <w:t>至</w:t>
+      </w:r>
+      <w:r>
+        <w:t>5</w:t>
+      </w:r>
+      <w:r>
+        <w:t>組目標家庭實走並保存去識別數據；三、取得</w:t>
+      </w:r>
+      <w:r>
+        <w:t>2</w:t>
+      </w:r>
+      <w:r>
+        <w:t>至</w:t>
+      </w:r>
+      <w:r>
+        <w:t>3</w:t>
+      </w:r>
+      <w:r>
+        <w:t>位導入端的任務與價格回饋；四、完成公開</w:t>
+      </w:r>
+      <w:r>
+        <w:t>HTTPS</w:t>
+      </w:r>
+      <w:r>
+        <w:t>、真手機與不同網路驗收。正式初審影片已完成；其餘只有取得證據後，才把相應結果寫進本計畫書。</w:t>
+      </w:r>
+    </w:p>
+    <w:p>
+      <w:pPr>
+        <w:pStyle w:val="HTH1"/>
+      </w:pPr>
+      <w:bookmarkStart w:id="25" w:name="_Toc234900741"/>
+      <w:r>
+        <w:t>第五章　參考資料</w:t>
+      </w:r>
+      <w:bookmarkEnd w:id="25"/>
+    </w:p>
+    <w:p>
+      <w:pPr>
+        <w:pStyle w:val="HTBody"/>
+      </w:pPr>
+      <w:r>
+        <w:t xml:space="preserve">[1] </w:t>
+      </w:r>
+      <w:r>
+        <w:t>教育部統計處（</w:t>
+      </w:r>
+      <w:r>
+        <w:t>2026</w:t>
+      </w:r>
+      <w:r>
+        <w:t>）。</w:t>
+      </w:r>
+      <w:r>
+        <w:t>114</w:t>
+      </w:r>
+      <w:r>
+        <w:t>學年度新住民子女就學開放資料（</w:t>
+      </w:r>
+      <w:r>
+        <w:t>2026</w:t>
+      </w:r>
+      <w:r>
+        <w:t>年</w:t>
+      </w:r>
+      <w:r>
+        <w:t>7</w:t>
+      </w:r>
+      <w:r>
+        <w:t>月</w:t>
+      </w:r>
+      <w:r>
+        <w:t>1</w:t>
+      </w:r>
+      <w:r>
+        <w:t>日更新）；本團隊依國籍別資料列重算。</w:t>
+      </w:r>
+      <w:r>
+        <w:t xml:space="preserve">https://data.gov.tw/dataset/46320 </w:t>
+      </w:r>
+      <w:r>
+        <w:t>；</w:t>
+      </w:r>
+      <w:r>
+        <w:t xml:space="preserve"> https://stats.moe.gov.tw/files/opendata/104_114edu_A_1_9.json </w:t>
+      </w:r>
+      <w:r>
+        <w:t>。課程班數另見《</w:t>
+      </w:r>
+      <w:r>
+        <w:t>113</w:t>
+      </w:r>
+      <w:r>
+        <w:t>學年度各級學校新住民子女就學概況》。</w:t>
+      </w:r>
+      <w:r>
+        <w:t>https://stats.moe.gov.tw/files/analysis/113_son_of_foreign.pdf</w:t>
+      </w:r>
+    </w:p>
+    <w:p>
+      <w:pPr>
+        <w:pStyle w:val="HTBody"/>
+      </w:pPr>
+      <w:r>
+        <w:t xml:space="preserve">[2] </w:t>
+      </w:r>
+      <w:r>
+        <w:t>教育部國民及學前教育署（</w:t>
+      </w:r>
+      <w:r>
+        <w:t>2021</w:t>
+      </w:r>
+      <w:r>
+        <w:t>）。第</w:t>
+      </w:r>
+      <w:r>
+        <w:t>224</w:t>
+      </w:r>
+      <w:r>
+        <w:t>期電子報：東南亞七國每種語言</w:t>
+      </w:r>
+      <w:r>
+        <w:t>18</w:t>
+      </w:r>
+      <w:r>
+        <w:t>冊、共</w:t>
+      </w:r>
+      <w:r>
+        <w:t>126</w:t>
+      </w:r>
+      <w:r>
+        <w:t>冊數位教材。</w:t>
+      </w:r>
+      <w:r>
+        <w:t>https://www.k12ea.gov.tw/Tw/Epaper/Index?id=542891ab-3778-491d-9c16-a2e0e5e056c7</w:t>
+      </w:r>
+    </w:p>
+    <w:p>
+      <w:pPr>
+        <w:pStyle w:val="HTBody"/>
+      </w:pPr>
+      <w:r>
+        <w:t xml:space="preserve">[3] </w:t>
+      </w:r>
+      <w:r>
+        <w:t>內政部移民署（</w:t>
+      </w:r>
+      <w:r>
+        <w:t>2024</w:t>
+      </w:r>
+      <w:r>
+        <w:t>）。《</w:t>
+      </w:r>
+      <w:r>
+        <w:t>112</w:t>
+      </w:r>
+      <w:r>
+        <w:t>年新住民生活需求調查報告》，調查方法頁</w:t>
+      </w:r>
+      <w:r>
+        <w:t>83</w:t>
+      </w:r>
+      <w:r>
+        <w:t>、</w:t>
+      </w:r>
+      <w:r>
+        <w:t>95</w:t>
+      </w:r>
+      <w:r>
+        <w:t>，表</w:t>
+      </w:r>
+      <w:r>
+        <w:t>7-21</w:t>
+      </w:r>
+      <w:r>
+        <w:t>頁</w:t>
+      </w:r>
+      <w:r>
+        <w:t>248</w:t>
+      </w:r>
+      <w:r>
+        <w:t>。</w:t>
+      </w:r>
+      <w:r>
+        <w:t>https://www.immigration.gov.tw/media/107730/112</w:t>
+      </w:r>
+      <w:r>
+        <w:t>年新住民生活需求調查報告</w:t>
+      </w:r>
+      <w:r>
+        <w:t>.pdf</w:t>
+      </w:r>
+    </w:p>
+    <w:p>
+      <w:pPr>
+        <w:pStyle w:val="HTBody"/>
+      </w:pPr>
+      <w:r>
+        <w:t xml:space="preserve">[4] </w:t>
+      </w:r>
+      <w:r>
+        <w:t>內政部移民署（</w:t>
+      </w:r>
+      <w:r>
+        <w:t>2023</w:t>
+      </w:r>
+      <w:r>
+        <w:t>）。《多元文化與語言學習之研究》，研究摘要頁</w:t>
+      </w:r>
+      <w:r>
+        <w:t>14</w:t>
+      </w:r>
+      <w:r>
+        <w:t>、樣本頁</w:t>
+      </w:r>
+      <w:r>
+        <w:t>98</w:t>
+      </w:r>
+      <w:r>
+        <w:t>、表</w:t>
+      </w:r>
+      <w:r>
+        <w:t>5-4</w:t>
+      </w:r>
+      <w:r>
+        <w:t>頁</w:t>
+      </w:r>
+      <w:r>
+        <w:t>105</w:t>
+      </w:r>
+      <w:r>
+        <w:t>、表</w:t>
+      </w:r>
+      <w:r>
+        <w:t>5-5</w:t>
+      </w:r>
+      <w:r>
+        <w:t>頁</w:t>
+      </w:r>
+      <w:r>
+        <w:t>106</w:t>
+      </w:r>
+      <w:r>
+        <w:t>、結論頁</w:t>
+      </w:r>
+      <w:r>
+        <w:t>182</w:t>
+      </w:r>
+      <w:r>
+        <w:t>至</w:t>
+      </w:r>
+      <w:r>
+        <w:t>184</w:t>
+      </w:r>
+      <w:r>
+        <w:t>。</w:t>
+      </w:r>
+      <w:r>
+        <w:t>https://www.immigration.gov.tw/media/101629/</w:t>
+      </w:r>
+      <w:r>
+        <w:t>多元文化與語言學習之研究</w:t>
+      </w:r>
+      <w:r>
+        <w:t>-1111f302.pdf</w:t>
+      </w:r>
+    </w:p>
+    <w:p>
+      <w:pPr>
+        <w:pStyle w:val="HTBody"/>
+      </w:pPr>
       <w:r>
         <w:lastRenderedPageBreak/>
-        <w:t>棒作品、家人圈重播與故事護照，以及</w:t>
+        <w:t xml:space="preserve">[5] </w:t>
+      </w:r>
+      <w:r>
+        <w:t>總統府（</w:t>
+      </w:r>
+      <w:r>
+        <w:t>2024</w:t>
+      </w:r>
+      <w:r>
+        <w:t>）。《新住民基本法》公布全文，第</w:t>
+      </w:r>
+      <w:r>
+        <w:t>2</w:t>
+      </w:r>
+      <w:r>
+        <w:t>條、第</w:t>
+      </w:r>
+      <w:r>
+        <w:t>12</w:t>
+      </w:r>
+      <w:r>
+        <w:t>條及第</w:t>
+      </w:r>
+      <w:r>
+        <w:t>19</w:t>
+      </w:r>
+      <w:r>
+        <w:t>條。</w:t>
+      </w:r>
+      <w:r>
+        <w:t>https://www.president.gov.tw/File/Doc/3a960df5-5ec7-4748-9646-04e2ef18f0e8</w:t>
+      </w:r>
+    </w:p>
+    <w:p>
+      <w:pPr>
+        <w:pStyle w:val="HTBody"/>
+      </w:pPr>
+      <w:r>
+        <w:t xml:space="preserve">[6] </w:t>
+      </w:r>
+      <w:r>
+        <w:t>教育部國民及學前教育署。〈政府網站資料開放宣告〉。</w:t>
+      </w:r>
+      <w:r>
+        <w:t>https://www.k12ea.gov.tw/Tw/Common/SinglePage?filter=7980A248-562A-4712-A4D6-2A0002D05FAB</w:t>
+      </w:r>
+    </w:p>
+    <w:p>
+      <w:pPr>
+        <w:pStyle w:val="HTBody"/>
+      </w:pPr>
+      <w:r>
+        <w:t xml:space="preserve">[7] </w:t>
+      </w:r>
+      <w:r>
+        <w:t>個人資料保護委員會籌備處。《個人資料保護法》，第</w:t>
       </w:r>
       <w:r>
         <w:t>3</w:t>
       </w:r>
       <w:r>
-        <w:t>筆官方資訊與本機延伸入口；五類接力不列為完成劇集。現行</w:t>
+        <w:t>、</w:t>
+      </w:r>
+      <w:r>
+        <w:t>5</w:t>
+      </w:r>
+      <w:r>
+        <w:t>、</w:t>
+      </w:r>
+      <w:r>
+        <w:t>8</w:t>
+      </w:r>
+      <w:r>
+        <w:t>及</w:t>
+      </w:r>
+      <w:r>
+        <w:t>19</w:t>
+      </w:r>
+      <w:r>
+        <w:t>條。</w:t>
+      </w:r>
+      <w:r>
+        <w:t>https://law.pdpc.gov.tw/LawContent.aspx?id=FL010627</w:t>
+      </w:r>
+    </w:p>
+    <w:p>
+      <w:pPr>
+        <w:pStyle w:val="HTBody"/>
+      </w:pPr>
+      <w:r>
+        <w:t xml:space="preserve">[8] </w:t>
+      </w:r>
+      <w:r>
+        <w:t>法務部（</w:t>
+      </w:r>
+      <w:r>
+        <w:t>2013</w:t>
+      </w:r>
+      <w:r>
+        <w:t>）。法律字第</w:t>
+      </w:r>
+      <w:r>
+        <w:t>10203504660</w:t>
+      </w:r>
+      <w:r>
+        <w:t>號函，未成年子女法定代理人同意相關說明。</w:t>
+      </w:r>
+      <w:r>
+        <w:t>https://mojlaw.moj.gov.tw/LawContentExShow.aspx?id=FE259164&amp;media=print&amp;type=e</w:t>
+      </w:r>
+    </w:p>
+    <w:p>
+      <w:pPr>
+        <w:pStyle w:val="HTBody"/>
+      </w:pPr>
+      <w:r>
+        <w:t>[9] Little, S.</w:t>
+      </w:r>
+      <w:r>
+        <w:t>（</w:t>
+      </w:r>
+      <w:r>
+        <w:t>2019</w:t>
+      </w:r>
+      <w:r>
+        <w:t>）。</w:t>
+      </w:r>
+      <w:r>
+        <w:t>“Is There an App for That?” Exploring Games and Apps among Heritage Language Families. Journal of Multilingual and Multicultural Development, 40(3), 218–229. https://doi.org/10.1080/01434632.2018.1502776</w:t>
+      </w:r>
+    </w:p>
+    <w:p>
+      <w:pPr>
+        <w:pStyle w:val="HTBody"/>
+      </w:pPr>
+      <w:r>
+        <w:t xml:space="preserve">[10] </w:t>
+      </w:r>
+      <w:r>
+        <w:t>鄭依萍、曾秀雲（</w:t>
+      </w:r>
+      <w:r>
+        <w:t>2024</w:t>
+      </w:r>
+      <w:r>
+        <w:t>）。〈母語的使用與傳承：以新北市新住民家庭為例〉。《社會發展研究學刊》，</w:t>
+      </w:r>
+      <w:r>
+        <w:t>34</w:t>
+      </w:r>
+      <w:r>
+        <w:t>。</w:t>
+      </w:r>
+      <w:r>
+        <w:t>https://doi.org/10.6687/JSDS.202409_(34).0002</w:t>
+      </w:r>
+    </w:p>
+    <w:p>
+      <w:pPr>
+        <w:pStyle w:val="HTBody"/>
+      </w:pPr>
+      <w:r>
+        <w:t xml:space="preserve">[11] </w:t>
+      </w:r>
+      <w:r>
+        <w:t>海外同類服務公開功能查核：家庭原聲課程、家庭錄音及物件感應語言工具。查核日期</w:t>
+      </w:r>
+      <w:r>
+        <w:t>2026</w:t>
+      </w:r>
+      <w:r>
+        <w:t>年</w:t>
+      </w:r>
+      <w:r>
+        <w:t>7</w:t>
+      </w:r>
+      <w:r>
+        <w:t>月</w:t>
+      </w:r>
+      <w:r>
+        <w:t>12</w:t>
+      </w:r>
+      <w:r>
+        <w:t>日；僅比較公開操作，不將其內容或素材納入作品。完整來源網址保存在競品查核工作底稿，送審引用格式須再依主辦匿名規則確認。</w:t>
+      </w:r>
+    </w:p>
+    <w:p>
+      <w:pPr>
+        <w:pStyle w:val="HTBody"/>
+      </w:pPr>
+      <w:r>
+        <w:t>[12] Piper</w:t>
+      </w:r>
+      <w:r>
+        <w:t>越南語合成操作示範：</w:t>
+      </w:r>
+      <w:r>
+        <w:t>Piper Voices v1.0.0</w:t>
+      </w:r>
+      <w:r>
+        <w:t>，</w:t>
+      </w:r>
+      <w:r>
+        <w:t>`vi_VN-vais1000-medium`</w:t>
+      </w:r>
+      <w:r>
+        <w:t>模型與模型卡；</w:t>
+      </w:r>
+      <w:r>
+        <w:t>Piper 2023.11.14-2</w:t>
+      </w:r>
+      <w:r>
+        <w:t>。模型庫標示</w:t>
+      </w:r>
+      <w:r>
+        <w:t>MIT</w:t>
+      </w:r>
+      <w:r>
+        <w:t>，模型卡將</w:t>
+      </w:r>
+      <w:r>
+        <w:t>VAIS-1000</w:t>
+      </w:r>
+      <w:r>
+        <w:t>語料列為</w:t>
+      </w:r>
+      <w:r>
+        <w:t>CC BY 4.0</w:t>
+      </w:r>
+      <w:r>
+        <w:t>；作品保存模型</w:t>
+      </w:r>
+      <w:r>
+        <w:t>SHA-256</w:t>
+      </w:r>
+      <w:r>
+        <w:t>、</w:t>
       </w:r>
       <w:r>
         <w:t>119</w:t>
       </w:r>
       <w:r>
-        <w:t>個引用音檔有單一可追溯來源與逐檔</w:t>
+        <w:t>筆輸入文字、產生腳本與逐檔</w:t>
       </w:r>
       <w:r>
         <w:t>manifest</w:t>
       </w:r>
       <w:r>
-        <w:t>，教師端另有</w:t>
-      </w:r>
-      <w:r>
-        <w:t>19</w:t>
-      </w:r>
-      <w:r>
-        <w:t>頁四週試辦包。</w:t>
+        <w:t>。</w:t>
+      </w:r>
+      <w:r>
+        <w:t xml:space="preserve">https://huggingface.co/rhasspy/piper-voices/tree/v1.0.0/vi/vi_VN/vais1000/medium </w:t>
+      </w:r>
+      <w:r>
+        <w:t>；</w:t>
+      </w:r>
+      <w:r>
+        <w:t xml:space="preserve"> https://github.com/rhasspy/piper/releases/tag/2023.11.14-2</w:t>
       </w:r>
     </w:p>
     <w:p>
@@ -5554,145 +6277,538 @@
         <w:pStyle w:val="HTBody"/>
       </w:pPr>
       <w:r>
-        <w:t>本次變更後的工程驗證為</w:t>
+        <w:t xml:space="preserve">[13] </w:t>
+      </w:r>
+      <w:r>
+        <w:t>教育部國民及學前教育署（</w:t>
+      </w:r>
+      <w:r>
+        <w:t>2025</w:t>
+      </w:r>
+      <w:r>
+        <w:t>）。</w:t>
+      </w:r>
+      <w:r>
+        <w:t>114</w:t>
+      </w:r>
+      <w:r>
+        <w:t>年度新住民語文樂學活動核定資料：</w:t>
+      </w:r>
+      <w:r>
+        <w:t>103</w:t>
+      </w:r>
+      <w:r>
+        <w:t>校、</w:t>
+      </w:r>
+      <w:r>
+        <w:t>124</w:t>
+      </w:r>
+      <w:r>
+        <w:t>班、總補助</w:t>
+      </w:r>
+      <w:r>
+        <w:t>4,824,776</w:t>
+      </w:r>
+      <w:r>
+        <w:t>元。</w:t>
+      </w:r>
+      <w:r>
+        <w:t>https://www.k12ea.gov.tw/Tw/PublickInfo/EdufundDetail?filter=588AEF47-226C-4164-95A8-EE5EA941567F&amp;id=686aed9d-cec5-44f4-9a30-863372e91e74</w:t>
+      </w:r>
+    </w:p>
+    <w:p>
+      <w:pPr>
+        <w:pStyle w:val="HTBody"/>
+      </w:pPr>
+      <w:r>
+        <w:t xml:space="preserve">[14] </w:t>
+      </w:r>
+      <w:r>
+        <w:t>地方教育主管機關轉發之</w:t>
+      </w:r>
+      <w:r>
+        <w:t>115</w:t>
+      </w:r>
+      <w:r>
+        <w:t>年度「新住民子女親子共學母語」申請公告；僅證明縣市申請體系仍在運作，不證明軟體可列支或本作已成合作通路。</w:t>
+      </w:r>
+      <w:r>
+        <w:t>https://news.hlc.edu.tw/index.php?cate_id=17&amp;id=124090&amp;page=department</w:t>
+      </w:r>
+    </w:p>
+    <w:p>
+      <w:pPr>
+        <w:pStyle w:val="HTBody"/>
+      </w:pPr>
+      <w:r>
+        <w:t xml:space="preserve">[15] </w:t>
+      </w:r>
+      <w:r>
+        <w:t>教育部國民及學前教育署（</w:t>
+      </w:r>
+      <w:r>
+        <w:t>2026</w:t>
+      </w:r>
+      <w:r>
+        <w:t>）。〈故事開麥啦！全國新住民語文說故事競賽展現多元文化魅力〉，</w:t>
+      </w:r>
+      <w:r>
+        <w:t>115</w:t>
+      </w:r>
+      <w:r>
+        <w:t>年</w:t>
+      </w:r>
+      <w:r>
+        <w:t>5</w:t>
+      </w:r>
+      <w:r>
+        <w:t>月</w:t>
+      </w:r>
+      <w:r>
+        <w:t>30</w:t>
+      </w:r>
+      <w:r>
+        <w:t>日；</w:t>
+      </w:r>
+      <w:r>
+        <w:t>172</w:t>
+      </w:r>
+      <w:r>
+        <w:t>校、</w:t>
+      </w:r>
+      <w:r>
+        <w:t>236</w:t>
+      </w:r>
+      <w:r>
+        <w:t>組初賽、</w:t>
+      </w:r>
+      <w:r>
+        <w:t>70</w:t>
+      </w:r>
+      <w:r>
+        <w:t>組決賽及三項故事主題。</w:t>
+      </w:r>
+      <w:r>
+        <w:lastRenderedPageBreak/>
+        <w:t xml:space="preserve">https://www.moe.gov.tw/News_Content.aspx?n=9E7AC85F1954DDA8&amp;s=9C06AFB083644471&amp;sms=169B8E91BB75571F </w:t>
+      </w:r>
+      <w:r>
+        <w:t>。查詢日：</w:t>
+      </w:r>
+      <w:r>
+        <w:t>2026</w:t>
+      </w:r>
+      <w:r>
+        <w:t>年</w:t>
+      </w:r>
+      <w:r>
+        <w:t>7</w:t>
+      </w:r>
+      <w:r>
+        <w:t>月</w:t>
+      </w:r>
+      <w:r>
+        <w:t>14</w:t>
+      </w:r>
+      <w:r>
+        <w:t>日。</w:t>
+      </w:r>
+    </w:p>
+    <w:p>
+      <w:pPr>
+        <w:pStyle w:val="HTBody"/>
+      </w:pPr>
+      <w:r>
+        <w:t xml:space="preserve">[16] </w:t>
+      </w:r>
+      <w:r>
+        <w:t>教育部國民及學前教育署。〈新住民子女教育資訊網〉：最新消息、語文教材、文件、相關計畫、課程與活動入口。</w:t>
+      </w:r>
+      <w:r>
+        <w:t xml:space="preserve">https://mkm.k12ea.gov.tw/ </w:t>
+      </w:r>
+      <w:r>
+        <w:t>。查詢日：</w:t>
+      </w:r>
+      <w:r>
+        <w:t>2026</w:t>
+      </w:r>
+      <w:r>
+        <w:t>年</w:t>
+      </w:r>
+      <w:r>
+        <w:t>7</w:t>
+      </w:r>
+      <w:r>
+        <w:t>月</w:t>
+      </w:r>
+      <w:r>
+        <w:t>14</w:t>
+      </w:r>
+      <w:r>
+        <w:t>日。</w:t>
+      </w:r>
+    </w:p>
+    <w:p>
+      <w:pPr>
+        <w:pStyle w:val="HTBody"/>
+      </w:pPr>
+      <w:r>
+        <w:t xml:space="preserve">[17] </w:t>
+      </w:r>
+      <w:r>
+        <w:t>教育部國民及學前教育署。〈新住民子女教育資訊網－研習活動〉：可依類別、縣市、狀態及日期查詢遠距直播、教學支援、競賽與研習。</w:t>
+      </w:r>
+      <w:r>
+        <w:t xml:space="preserve">https://mkm.k12ea.gov.tw/study </w:t>
+      </w:r>
+      <w:r>
+        <w:t>。查詢日：</w:t>
+      </w:r>
+      <w:r>
+        <w:t>2026</w:t>
+      </w:r>
+      <w:r>
+        <w:t>年</w:t>
+      </w:r>
+      <w:r>
+        <w:t>7</w:t>
+      </w:r>
+      <w:r>
+        <w:t>月</w:t>
+      </w:r>
+      <w:r>
+        <w:t>14</w:t>
+      </w:r>
+      <w:r>
+        <w:t>日。</w:t>
+      </w:r>
+    </w:p>
+    <w:p>
+      <w:pPr>
+        <w:pStyle w:val="HTBody"/>
+      </w:pPr>
+      <w:r>
+        <w:t xml:space="preserve">[18] </w:t>
+      </w:r>
+      <w:r>
+        <w:t>教育部（</w:t>
+      </w:r>
+      <w:r>
+        <w:t>2026</w:t>
+      </w:r>
+      <w:r>
+        <w:t>）。〈重大教育政策發展歷程－新住民教育〉：課綱七語、</w:t>
+      </w:r>
+      <w:r>
+        <w:t>126</w:t>
+      </w:r>
+      <w:r>
+        <w:t>冊教材、遠距直播、新住民學習中心及教育資訊網</w:t>
+      </w:r>
+      <w:r>
+        <w:t>2.0</w:t>
+      </w:r>
+      <w:r>
+        <w:t>。</w:t>
+      </w:r>
+      <w:r>
+        <w:t xml:space="preserve">https://history.moe.gov.tw/Policy/Detail/99bc4e53-3e97-4395-8a76-acfbce2ce7d7 </w:t>
+      </w:r>
+      <w:r>
+        <w:t>。查詢日：</w:t>
+      </w:r>
+      <w:r>
+        <w:t>2026</w:t>
+      </w:r>
+      <w:r>
+        <w:t>年</w:t>
+      </w:r>
+      <w:r>
+        <w:t>7</w:t>
+      </w:r>
+      <w:r>
+        <w:t>月</w:t>
+      </w:r>
+      <w:r>
+        <w:t>14</w:t>
+      </w:r>
+      <w:r>
+        <w:t>日。</w:t>
+      </w:r>
+    </w:p>
+    <w:p>
+      <w:pPr>
+        <w:pStyle w:val="HTBody"/>
+      </w:pPr>
+      <w:r>
+        <w:t xml:space="preserve">[19] </w:t>
+      </w:r>
+      <w:r>
+        <w:t>教育部國民及學前教育署（</w:t>
+      </w:r>
+      <w:r>
+        <w:t>2026</w:t>
+      </w:r>
+      <w:r>
+        <w:t>）。〈</w:t>
+      </w:r>
+      <w:r>
+        <w:t>115</w:t>
+      </w:r>
+      <w:r>
+        <w:t>年全國性多語多元文化繪本親子共讀心得感想甄選活動計畫及海報〉；活動簡章由該公告附檔提供。</w:t>
+      </w:r>
+      <w:r>
+        <w:t xml:space="preserve">https://mkm.k12ea.gov.tw/news/17202605110001 </w:t>
+      </w:r>
+      <w:r>
+        <w:t>。查詢日：</w:t>
+      </w:r>
+      <w:r>
+        <w:t>2026</w:t>
+      </w:r>
+      <w:r>
+        <w:t>年</w:t>
+      </w:r>
+      <w:r>
+        <w:t>7</w:t>
+      </w:r>
+      <w:r>
+        <w:t>月</w:t>
+      </w:r>
+      <w:r>
+        <w:t>14</w:t>
+      </w:r>
+      <w:r>
+        <w:t>日。</w:t>
+      </w:r>
+    </w:p>
+    <w:p>
+      <w:pPr>
+        <w:pStyle w:val="HTH1"/>
+      </w:pPr>
+      <w:bookmarkStart w:id="26" w:name="_Toc234900742"/>
+      <w:r>
+        <w:t>第六章　附件</w:t>
+      </w:r>
+      <w:bookmarkEnd w:id="26"/>
+    </w:p>
+    <w:p>
+      <w:pPr>
+        <w:pStyle w:val="HTH2"/>
+      </w:pPr>
+      <w:bookmarkStart w:id="27" w:name="_Toc234900743"/>
+      <w:r>
+        <w:t>一、作品檔案與使用說明</w:t>
+      </w:r>
+      <w:bookmarkEnd w:id="27"/>
+    </w:p>
+    <w:p>
+      <w:pPr>
+        <w:pStyle w:val="HTBullet"/>
+      </w:pPr>
+      <w:r>
+        <w:t xml:space="preserve">• </w:t>
+      </w:r>
+      <w:r>
+        <w:t>可直接建置的</w:t>
+      </w:r>
+      <w:r>
+        <w:t>Flutter Web</w:t>
+      </w:r>
+      <w:r>
+        <w:t>原始碼、相對路徑</w:t>
+      </w:r>
+      <w:r>
+        <w:t>release</w:t>
+      </w:r>
+      <w:r>
+        <w:t>與本機啟動／停止腳本。</w:t>
+      </w:r>
+    </w:p>
+    <w:p>
+      <w:pPr>
+        <w:pStyle w:val="HTBullet"/>
+      </w:pPr>
+      <w:r>
+        <w:t xml:space="preserve">• </w:t>
+      </w:r>
+      <w:r>
+        <w:t>最新操作說明、</w:t>
       </w:r>
       <w:r>
         <w:t>Flutter</w:t>
       </w:r>
       <w:r>
-        <w:t>靜態分析</w:t>
-      </w:r>
-      <w:r>
-        <w:t>0</w:t>
-      </w:r>
-      <w:r>
-        <w:t>問題、</w:t>
-      </w:r>
-      <w:r>
-        <w:t>Flutter</w:t>
-      </w:r>
-      <w:r>
-        <w:t>測試</w:t>
-      </w:r>
-      <w:r>
-        <w:t>133</w:t>
+        <w:t>完整品質閘門、</w:t>
+      </w:r>
+      <w:r>
+        <w:t>Chromium</w:t>
       </w:r>
       <w:r>
         <w:t>／</w:t>
       </w:r>
       <w:r>
-        <w:t>133</w:t>
-      </w:r>
-      <w:r>
-        <w:t>、相對路徑</w:t>
-      </w:r>
-      <w:r>
-        <w:t>Web build</w:t>
-      </w:r>
-      <w:r>
-        <w:t>與完整品質閘門通過；來源版由</w:t>
-      </w:r>
-      <w:r>
-        <w:t>Chromium</w:t>
-      </w:r>
-      <w:r>
-        <w:t>與</w:t>
-      </w:r>
-      <w:r>
         <w:t>Edge</w:t>
       </w:r>
       <w:r>
-        <w:t>各一次不間斷跑完</w:t>
-      </w:r>
-      <w:r>
-        <w:t>7</w:t>
+        <w:t>操作與</w:t>
+      </w:r>
+      <w:r>
+        <w:t>Pixel 7</w:t>
+      </w:r>
+      <w:r>
+        <w:t>視覺流程、音訊</w:t>
+      </w:r>
+      <w:r>
+        <w:t>manifest</w:t>
+      </w:r>
+      <w:r>
+        <w:t>、插圖來源邊界與技術驗證紀錄。</w:t>
+      </w:r>
+    </w:p>
+    <w:p>
+      <w:pPr>
+        <w:pStyle w:val="HTBullet"/>
+      </w:pPr>
+      <w:r>
+        <w:t xml:space="preserve">• </w:t>
+      </w:r>
+      <w:r>
+        <w:t>本計畫書</w:t>
+      </w:r>
+      <w:r>
+        <w:t>DOCX</w:t>
       </w:r>
       <w:r>
         <w:t>／</w:t>
       </w:r>
       <w:r>
-        <w:t>7</w:t>
-      </w:r>
-      <w:r>
-        <w:t>，兩組皆包含</w:t>
-      </w:r>
-      <w:r>
-        <w:t>Pixel 7 viewport</w:t>
-      </w:r>
-      <w:r>
-        <w:t>視覺</w:t>
-      </w:r>
-      <w:r>
-        <w:t>2</w:t>
+        <w:t>PDF</w:t>
+      </w:r>
+      <w:r>
+        <w:t>、四張由現況資料與真實</w:t>
+      </w:r>
+      <w:r>
+        <w:t>App</w:t>
+      </w:r>
+      <w:r>
+        <w:t>畫面產生的圖表。</w:t>
+      </w:r>
+    </w:p>
+    <w:p>
+      <w:pPr>
+        <w:pStyle w:val="HTBullet"/>
+      </w:pPr>
+      <w:r>
+        <w:t>• 2</w:t>
+      </w:r>
+      <w:r>
+        <w:t>分</w:t>
+      </w:r>
+      <w:r>
+        <w:t>53.9</w:t>
+      </w:r>
+      <w:r>
+        <w:t>秒正式初審</w:t>
+      </w:r>
+      <w:r>
+        <w:t>MP4</w:t>
+      </w:r>
+      <w:r>
+        <w:t>、低於</w:t>
+      </w:r>
+      <w:r>
+        <w:t>25 MiB</w:t>
+      </w:r>
+      <w:r>
+        <w:t>的網頁預覽、分鏡、可重現產生腳本與</w:t>
+      </w:r>
+      <w:r>
+        <w:t>ffprobe</w:t>
       </w:r>
       <w:r>
         <w:t>／</w:t>
       </w:r>
       <w:r>
-        <w:t>2</w:t>
-      </w:r>
-      <w:r>
-        <w:t>與</w:t>
+        <w:t>EBU R128</w:t>
+      </w:r>
+      <w:r>
+        <w:t>驗證</w:t>
+      </w:r>
+      <w:r>
+        <w:t>JSON</w:t>
+      </w:r>
+      <w:r>
+        <w:t>；</w:t>
+      </w:r>
+      <w:r>
+        <w:t>15</w:t>
+      </w:r>
+      <w:r>
+        <w:t>幕旁白及逐段響度均通過門檻。</w:t>
+      </w:r>
+    </w:p>
+    <w:p>
+      <w:pPr>
+        <w:pStyle w:val="HTBullet"/>
+      </w:pPr>
+      <w:r>
+        <w:t xml:space="preserve">• </w:t>
+      </w:r>
+      <w:r>
+        <w:t>新住民家庭匿名問卷與試用方案；尚未回收的結果不列成果。</w:t>
+      </w:r>
+    </w:p>
+    <w:p>
+      <w:pPr>
+        <w:pStyle w:val="HTBullet"/>
+      </w:pPr>
+      <w:r>
+        <w:t>• 119</w:t>
+      </w:r>
+      <w:r>
+        <w:t>句越南語母語審閱工具；可逐檔播放並匯出</w:t>
+      </w:r>
+      <w:r>
+        <w:t>JSON</w:t>
+      </w:r>
+      <w:r>
+        <w:t>／</w:t>
+      </w:r>
+      <w:r>
+        <w:t>CSV</w:t>
+      </w:r>
+      <w:r>
+        <w:t>，但目前空白工具不列真人審閱成果。</w:t>
+      </w:r>
+    </w:p>
+    <w:p>
+      <w:pPr>
+        <w:pStyle w:val="HTH2"/>
+      </w:pPr>
+      <w:bookmarkStart w:id="28" w:name="_Toc234900744"/>
+      <w:r>
+        <w:t>二、資料與兒少保護原則</w:t>
+      </w:r>
+      <w:bookmarkEnd w:id="28"/>
+    </w:p>
+    <w:p>
+      <w:pPr>
+        <w:pStyle w:val="HTBody"/>
+      </w:pPr>
+      <w:r>
+        <w:t>家庭內容預設只限目前裝置與已核准家人。</w:t>
       </w:r>
       <w:r>
         <w:t>Web</w:t>
       </w:r>
       <w:r>
-        <w:t>行為</w:t>
-      </w:r>
-      <w:r>
-        <w:t>5</w:t>
-      </w:r>
-      <w:r>
-        <w:t>／</w:t>
-      </w:r>
-      <w:r>
-        <w:t>5</w:t>
-      </w:r>
-      <w:r>
-        <w:t>。首句音訊案例要求同一次明確點擊取得</w:t>
-      </w:r>
-      <w:r>
-        <w:t>MP3 HTTP 200</w:t>
-      </w:r>
-      <w:r>
-        <w:t>，並觀察</w:t>
-      </w:r>
-      <w:r>
-        <w:t>play</w:t>
-      </w:r>
-      <w:r>
-        <w:t>、</w:t>
-      </w:r>
-      <w:r>
-        <w:t>playing</w:t>
-      </w:r>
-      <w:r>
-        <w:t>與</w:t>
-      </w:r>
-      <w:r>
-        <w:t>ended</w:t>
-      </w:r>
-      <w:r>
-        <w:t>且無</w:t>
-      </w:r>
-      <w:r>
-        <w:t>error</w:t>
-      </w:r>
-      <w:r>
-        <w:t>。</w:t>
-      </w:r>
-      <w:r>
-        <w:t>Pixel 7</w:t>
-      </w:r>
-      <w:r>
-        <w:t>只是瀏覽器</w:t>
-      </w:r>
-      <w:r>
-        <w:t>viewport</w:t>
-      </w:r>
-      <w:r>
-        <w:t>，不是真機。工程測試證明狀態、路徑與失敗修復，不證明孩子看得懂、越南語自然或家庭會長期使用。</w:t>
+        <w:t>版不要求真實姓名，也不主動把家庭錄音送到團隊伺服器；文字備份不含錄音本體、個別家人碼、邀請私鑰或重試狀態。成人可刪除家庭資料；應用層加密、雲端同步、帳號復原與系統備份控制尚未完成，介面不得把本機原型稱為產品級安全社群。</w:t>
+      </w:r>
+      <w:r>
+        <w:t>[7][8]</w:t>
       </w:r>
     </w:p>
     <w:p>
@@ -5700,1105 +6816,16 @@
         <w:pStyle w:val="HTBody"/>
       </w:pPr>
       <w:r>
-        <w:t>送件前優先完成四件事：一、由越南語母語者逐句複聽</w:t>
-      </w:r>
-      <w:r>
-        <w:t>119</w:t>
-      </w:r>
-      <w:r>
-        <w:t>檔並留下修訂紀錄；二、以</w:t>
-      </w:r>
-      <w:r>
-        <w:t>3</w:t>
-      </w:r>
-      <w:r>
-        <w:t>至</w:t>
-      </w:r>
-      <w:r>
-        <w:t>5</w:t>
-      </w:r>
-      <w:r>
-        <w:t>組目標家庭實走並保存去識別數據；三、取得</w:t>
-      </w:r>
-      <w:r>
-        <w:t>2</w:t>
-      </w:r>
-      <w:r>
-        <w:t>至</w:t>
-      </w:r>
-      <w:r>
-        <w:t>3</w:t>
-      </w:r>
-      <w:r>
-        <w:t>位導入端的任務與價格回饋；四、完成公開</w:t>
-      </w:r>
-      <w:r>
-        <w:t>HTTPS</w:t>
-      </w:r>
-      <w:r>
-        <w:t>、真手機與不同網路驗收。正式初審影片已完成；其餘只有取得證據後，才把相應結果寫進本計畫書。</w:t>
-      </w:r>
-    </w:p>
-    <w:p>
-      <w:pPr>
-        <w:pStyle w:val="HTH1"/>
-      </w:pPr>
-      <w:bookmarkStart w:id="25" w:name="_Toc234893829"/>
-      <w:r>
-        <w:t>第五章　參考資料</w:t>
-      </w:r>
-      <w:bookmarkEnd w:id="25"/>
-    </w:p>
-    <w:p>
-      <w:pPr>
-        <w:pStyle w:val="HTBody"/>
-      </w:pPr>
-      <w:r>
-        <w:t xml:space="preserve">[1] </w:t>
-      </w:r>
-      <w:r>
-        <w:t>教育部統計處（</w:t>
-      </w:r>
-      <w:r>
-        <w:t>2026</w:t>
-      </w:r>
-      <w:r>
-        <w:t>）。</w:t>
-      </w:r>
-      <w:r>
-        <w:t>114</w:t>
-      </w:r>
-      <w:r>
-        <w:t>學年度新住民子女就學開放資料（</w:t>
-      </w:r>
-      <w:r>
-        <w:t>2026</w:t>
-      </w:r>
-      <w:r>
-        <w:t>年</w:t>
-      </w:r>
-      <w:r>
-        <w:t>7</w:t>
-      </w:r>
-      <w:r>
-        <w:t>月</w:t>
-      </w:r>
-      <w:r>
-        <w:t>1</w:t>
-      </w:r>
-      <w:r>
-        <w:t>日更新）；本團隊依國籍別資料列重算。</w:t>
-      </w:r>
-      <w:r>
-        <w:t xml:space="preserve">https://data.gov.tw/dataset/46320 </w:t>
-      </w:r>
-      <w:r>
-        <w:t>；</w:t>
-      </w:r>
-      <w:r>
-        <w:t xml:space="preserve"> https://stats.moe.gov.tw/files/opendata/104_114edu_A_1_9.json </w:t>
-      </w:r>
-      <w:r>
-        <w:t>。課程班數另見《</w:t>
-      </w:r>
-      <w:r>
-        <w:t>113</w:t>
-      </w:r>
-      <w:r>
-        <w:t>學年度各級學校新住民子女就學概況》。</w:t>
-      </w:r>
-      <w:r>
-        <w:t>https://stats.moe.gov.tw/files/analysis/113_son_of_foreign.pdf</w:t>
-      </w:r>
-    </w:p>
-    <w:p>
-      <w:pPr>
-        <w:pStyle w:val="HTBody"/>
-      </w:pPr>
-      <w:r>
-        <w:t xml:space="preserve">[2] </w:t>
-      </w:r>
-      <w:r>
-        <w:t>教育部國民及學前教育署（</w:t>
-      </w:r>
-      <w:r>
-        <w:t>2021</w:t>
-      </w:r>
-      <w:r>
-        <w:t>）。第</w:t>
-      </w:r>
-      <w:r>
-        <w:t>224</w:t>
-      </w:r>
-      <w:r>
-        <w:t>期電子報：東南亞七國每種語言</w:t>
-      </w:r>
-      <w:r>
-        <w:t>18</w:t>
-      </w:r>
-      <w:r>
-        <w:t>冊、共</w:t>
-      </w:r>
-      <w:r>
-        <w:t>126</w:t>
-      </w:r>
-      <w:r>
-        <w:t>冊數位教材。</w:t>
-      </w:r>
-      <w:r>
-        <w:t>https://www.k12ea.gov.tw/Tw/Epaper/Index?id=542891ab-3778-491d-9c16-a2e0e5e056c7</w:t>
-      </w:r>
-    </w:p>
-    <w:p>
-      <w:pPr>
-        <w:pStyle w:val="HTBody"/>
-      </w:pPr>
-      <w:r>
-        <w:t xml:space="preserve">[3] </w:t>
-      </w:r>
-      <w:r>
-        <w:t>內政部移民署（</w:t>
-      </w:r>
-      <w:r>
-        <w:t>2024</w:t>
-      </w:r>
-      <w:r>
-        <w:t>）。《</w:t>
-      </w:r>
-      <w:r>
-        <w:t>112</w:t>
-      </w:r>
-      <w:r>
-        <w:t>年新住民生活需求調查報告》，調查方法頁</w:t>
-      </w:r>
-      <w:r>
-        <w:t>83</w:t>
-      </w:r>
-      <w:r>
-        <w:t>、</w:t>
-      </w:r>
-      <w:r>
-        <w:t>95</w:t>
-      </w:r>
-      <w:r>
-        <w:t>，表</w:t>
-      </w:r>
-      <w:r>
-        <w:t>7-21</w:t>
-      </w:r>
-      <w:r>
-        <w:t>頁</w:t>
-      </w:r>
-      <w:r>
-        <w:t>248</w:t>
-      </w:r>
-      <w:r>
-        <w:t>。</w:t>
-      </w:r>
-      <w:r>
-        <w:t>https://www.immigration.gov.tw/media/107730/112</w:t>
-      </w:r>
-      <w:r>
-        <w:t>年新住民生活需求調查報告</w:t>
-      </w:r>
-      <w:r>
-        <w:t>.pdf</w:t>
-      </w:r>
-    </w:p>
-    <w:p>
-      <w:pPr>
-        <w:pStyle w:val="HTBody"/>
-      </w:pPr>
-      <w:r>
-        <w:t xml:space="preserve">[4] </w:t>
-      </w:r>
-      <w:r>
-        <w:t>內政部移民署（</w:t>
-      </w:r>
-      <w:r>
-        <w:t>2023</w:t>
-      </w:r>
-      <w:r>
-        <w:t>）。《多元文化與語言學習之研究》，研究摘要頁</w:t>
-      </w:r>
-      <w:r>
-        <w:t>14</w:t>
-      </w:r>
-      <w:r>
-        <w:t>、樣本頁</w:t>
-      </w:r>
-      <w:r>
-        <w:t>98</w:t>
-      </w:r>
-      <w:r>
-        <w:t>、表</w:t>
-      </w:r>
-      <w:r>
-        <w:t>5-4</w:t>
-      </w:r>
-      <w:r>
-        <w:t>頁</w:t>
-      </w:r>
-      <w:r>
-        <w:t>105</w:t>
-      </w:r>
-      <w:r>
-        <w:t>、表</w:t>
-      </w:r>
-      <w:r>
-        <w:t>5-5</w:t>
-      </w:r>
-      <w:r>
-        <w:t>頁</w:t>
-      </w:r>
-      <w:r>
-        <w:t>106</w:t>
-      </w:r>
-      <w:r>
-        <w:t>、結論頁</w:t>
-      </w:r>
-      <w:r>
-        <w:t>182</w:t>
-      </w:r>
-      <w:r>
-        <w:t>至</w:t>
-      </w:r>
-      <w:r>
-        <w:t>184</w:t>
-      </w:r>
-      <w:r>
-        <w:t>。</w:t>
-      </w:r>
-      <w:r>
-        <w:t>https://www.immigration.gov.tw/media/101629/</w:t>
-      </w:r>
-      <w:r>
-        <w:t>多元文化與語言學習之研究</w:t>
-      </w:r>
-      <w:r>
-        <w:t>-1111f302.pdf</w:t>
-      </w:r>
-    </w:p>
-    <w:p>
-      <w:pPr>
-        <w:pStyle w:val="HTBody"/>
-      </w:pPr>
-      <w:r>
-        <w:t xml:space="preserve">[5] </w:t>
-      </w:r>
-      <w:r>
-        <w:t>總統府（</w:t>
-      </w:r>
-      <w:r>
-        <w:t>2024</w:t>
-      </w:r>
-      <w:r>
-        <w:t>）。《新住民基本法》公布全文，第</w:t>
-      </w:r>
-      <w:r>
-        <w:t>2</w:t>
-      </w:r>
-      <w:r>
-        <w:t>條、第</w:t>
-      </w:r>
-      <w:r>
-        <w:t>12</w:t>
-      </w:r>
-      <w:r>
-        <w:t>條及第</w:t>
-      </w:r>
-      <w:r>
-        <w:t>19</w:t>
-      </w:r>
-      <w:r>
-        <w:t>條。</w:t>
-      </w:r>
-      <w:r>
-        <w:t>https://www.president.gov.tw/File/Doc/3a960df5-5ec7-4748-9646-04e2ef18f0e8</w:t>
-      </w:r>
-    </w:p>
-    <w:p>
-      <w:pPr>
-        <w:pStyle w:val="HTBody"/>
-      </w:pPr>
-      <w:r>
-        <w:t xml:space="preserve">[6] </w:t>
-      </w:r>
-      <w:r>
-        <w:t>教育部國民及學前教育署。〈政府網站資料開放宣告〉。</w:t>
-      </w:r>
-      <w:r>
-        <w:t>https://www.k12ea.gov.tw/Tw/Common/SinglePage?filter=7980A248-562A-4712-A4D6-2A0002D05FAB</w:t>
-      </w:r>
-    </w:p>
-    <w:p>
-      <w:pPr>
-        <w:pStyle w:val="HTBody"/>
-      </w:pPr>
-      <w:r>
         <w:lastRenderedPageBreak/>
-        <w:t xml:space="preserve">[7] </w:t>
-      </w:r>
-      <w:r>
-        <w:t>個人資料保護委員會籌備處。《個人資料保護法》，第</w:t>
-      </w:r>
-      <w:r>
-        <w:t>3</w:t>
-      </w:r>
-      <w:r>
-        <w:t>、</w:t>
-      </w:r>
-      <w:r>
-        <w:t>5</w:t>
-      </w:r>
-      <w:r>
-        <w:t>、</w:t>
-      </w:r>
-      <w:r>
-        <w:t>8</w:t>
-      </w:r>
-      <w:r>
-        <w:t>及</w:t>
-      </w:r>
-      <w:r>
-        <w:t>19</w:t>
-      </w:r>
-      <w:r>
-        <w:t>條。</w:t>
-      </w:r>
-      <w:r>
-        <w:t>https://law.pdpc.gov.tw/LawContent.aspx?id=FL010627</w:t>
-      </w:r>
-    </w:p>
-    <w:p>
-      <w:pPr>
-        <w:pStyle w:val="HTBody"/>
-      </w:pPr>
-      <w:r>
-        <w:t xml:space="preserve">[8] </w:t>
-      </w:r>
-      <w:r>
-        <w:t>法務部（</w:t>
-      </w:r>
-      <w:r>
-        <w:t>2013</w:t>
-      </w:r>
-      <w:r>
-        <w:t>）。法律字第</w:t>
-      </w:r>
-      <w:r>
-        <w:t>10203504660</w:t>
-      </w:r>
-      <w:r>
-        <w:t>號函，未成年子女法定代理人同意相關說明。</w:t>
-      </w:r>
-      <w:r>
-        <w:t>https://mojlaw.moj.gov.tw/LawContentExShow.aspx?id=FE259164&amp;media=print&amp;type=e</w:t>
-      </w:r>
-    </w:p>
-    <w:p>
-      <w:pPr>
-        <w:pStyle w:val="HTBody"/>
-      </w:pPr>
-      <w:r>
-        <w:t>[9] Little, S.</w:t>
-      </w:r>
-      <w:r>
-        <w:t>（</w:t>
-      </w:r>
-      <w:r>
-        <w:t>2019</w:t>
-      </w:r>
-      <w:r>
-        <w:t>）。</w:t>
-      </w:r>
-      <w:r>
-        <w:t>“Is There an App for That?” Exploring Games and Apps among Heritage Language Families. Journal of Multilingual and Multicultural Development, 40(3), 218–229. https://doi.org/10.1080/01434632.2018.1502776</w:t>
-      </w:r>
-    </w:p>
-    <w:p>
-      <w:pPr>
-        <w:pStyle w:val="HTBody"/>
-      </w:pPr>
-      <w:r>
-        <w:t xml:space="preserve">[10] </w:t>
-      </w:r>
-      <w:r>
-        <w:t>鄭依萍、曾秀雲（</w:t>
-      </w:r>
-      <w:r>
-        <w:t>2024</w:t>
-      </w:r>
-      <w:r>
-        <w:t>）。〈母語的使用與傳承：以新北市新住民家庭為例〉。《社會發展研究學刊》，</w:t>
-      </w:r>
-      <w:r>
-        <w:t>34</w:t>
-      </w:r>
-      <w:r>
-        <w:t>。</w:t>
-      </w:r>
-      <w:r>
-        <w:t>https://doi.org/10.6687/JSDS.202409_(34).0002</w:t>
-      </w:r>
-    </w:p>
-    <w:p>
-      <w:pPr>
-        <w:pStyle w:val="HTBody"/>
-      </w:pPr>
-      <w:r>
-        <w:t xml:space="preserve">[11] </w:t>
-      </w:r>
-      <w:r>
-        <w:t>海外同類服務公開功能查核：家庭原聲課程、家庭錄音及物件感應語言工具。查核日期</w:t>
-      </w:r>
-      <w:r>
-        <w:t>2026</w:t>
-      </w:r>
-      <w:r>
-        <w:t>年</w:t>
-      </w:r>
-      <w:r>
-        <w:t>7</w:t>
-      </w:r>
-      <w:r>
-        <w:t>月</w:t>
-      </w:r>
-      <w:r>
-        <w:t>12</w:t>
-      </w:r>
-      <w:r>
-        <w:t>日；僅比較公開操作，不將其內容或素材納入作品。完整來源網址保存在競品查核工作底稿，送審引用格式須再依主辦匿名規則確認。</w:t>
-      </w:r>
-    </w:p>
-    <w:p>
-      <w:pPr>
-        <w:pStyle w:val="HTBody"/>
-      </w:pPr>
-      <w:r>
-        <w:t>[12] Piper</w:t>
-      </w:r>
-      <w:r>
-        <w:t>越南語合成操作示範：</w:t>
-      </w:r>
-      <w:r>
-        <w:t>Piper Voices v1.0.0</w:t>
-      </w:r>
-      <w:r>
-        <w:t>，</w:t>
-      </w:r>
-      <w:r>
-        <w:t>`vi_VN-vais1000-medium`</w:t>
-      </w:r>
-      <w:r>
-        <w:t>模型與模型卡；</w:t>
-      </w:r>
-      <w:r>
-        <w:t>Piper 2023.11.14-2</w:t>
-      </w:r>
-      <w:r>
-        <w:t>。模型庫標示</w:t>
-      </w:r>
-      <w:r>
-        <w:t>MIT</w:t>
-      </w:r>
-      <w:r>
-        <w:t>，模型卡將</w:t>
-      </w:r>
-      <w:r>
-        <w:t>VAIS-1000</w:t>
-      </w:r>
-      <w:r>
-        <w:t>語料列為</w:t>
-      </w:r>
-      <w:r>
-        <w:t>CC BY 4.0</w:t>
-      </w:r>
-      <w:r>
-        <w:t>；作品保存模型</w:t>
-      </w:r>
-      <w:r>
-        <w:t>SHA-256</w:t>
-      </w:r>
-      <w:r>
-        <w:t>、</w:t>
-      </w:r>
-      <w:r>
-        <w:t>119</w:t>
-      </w:r>
-      <w:r>
-        <w:t>筆輸入文字、產生腳本與逐檔</w:t>
-      </w:r>
-      <w:r>
-        <w:t>manifest</w:t>
-      </w:r>
-      <w:r>
-        <w:t>。</w:t>
-      </w:r>
-      <w:r>
-        <w:t xml:space="preserve">https://huggingface.co/rhasspy/piper-voices/tree/v1.0.0/vi/vi_VN/vais1000/medium </w:t>
-      </w:r>
-      <w:r>
-        <w:t>；</w:t>
-      </w:r>
-      <w:r>
-        <w:t xml:space="preserve"> https://github.com/rhasspy/piper/releases/tag/2023.11.14-2</w:t>
-      </w:r>
-    </w:p>
-    <w:p>
-      <w:pPr>
-        <w:pStyle w:val="HTBody"/>
-      </w:pPr>
-      <w:r>
-        <w:t xml:space="preserve">[13] </w:t>
-      </w:r>
-      <w:r>
-        <w:t>教育部國民及學前教育署（</w:t>
-      </w:r>
-      <w:r>
-        <w:t>2025</w:t>
-      </w:r>
-      <w:r>
-        <w:t>）。</w:t>
-      </w:r>
-      <w:r>
-        <w:t>114</w:t>
-      </w:r>
-      <w:r>
-        <w:t>年度新住民語文樂學活動核定資料：</w:t>
-      </w:r>
-      <w:r>
-        <w:t>103</w:t>
-      </w:r>
-      <w:r>
-        <w:t>校、</w:t>
-      </w:r>
-      <w:r>
-        <w:t>124</w:t>
-      </w:r>
-      <w:r>
-        <w:t>班、總補助</w:t>
-      </w:r>
-      <w:r>
-        <w:t>4,824,776</w:t>
-      </w:r>
-      <w:r>
-        <w:t>元。</w:t>
-      </w:r>
-      <w:r>
-        <w:t>https://www.k12ea.gov.tw/Tw/PublickInfo/EdufundDetail?filter=588AEF47-226C-4164-95A8-EE5EA941567F&amp;id=686aed9d-cec5-44f4-9a30-863372e91e74</w:t>
-      </w:r>
-    </w:p>
-    <w:p>
-      <w:pPr>
-        <w:pStyle w:val="HTBody"/>
-      </w:pPr>
-      <w:r>
-        <w:t xml:space="preserve">[14] </w:t>
-      </w:r>
-      <w:r>
-        <w:t>地方教育主管機關轉發之</w:t>
-      </w:r>
-      <w:r>
-        <w:t>115</w:t>
-      </w:r>
-      <w:r>
-        <w:t>年度「新住民子女親子共學母語」申請公告；僅證明縣市申請體系仍在運作，不證明軟體可列支或本作已成合作通路。</w:t>
-      </w:r>
-      <w:r>
-        <w:t>https://news.hlc.edu.tw/index.php?cate_id=17&amp;id=124090&amp;page=department</w:t>
-      </w:r>
-    </w:p>
-    <w:p>
-      <w:pPr>
-        <w:pStyle w:val="HTBody"/>
-      </w:pPr>
-      <w:r>
-        <w:t xml:space="preserve">[15] </w:t>
-      </w:r>
-      <w:r>
-        <w:t>教育部國民及學前教育署（</w:t>
-      </w:r>
-      <w:r>
-        <w:t>2026</w:t>
-      </w:r>
-      <w:r>
-        <w:t>）。〈故事開麥啦！全國新住民語文說故事競賽展現多元文化魅力〉，</w:t>
-      </w:r>
-      <w:r>
-        <w:t>115</w:t>
-      </w:r>
-      <w:r>
-        <w:t>年</w:t>
-      </w:r>
-      <w:r>
-        <w:t>5</w:t>
-      </w:r>
-      <w:r>
-        <w:t>月</w:t>
-      </w:r>
-      <w:r>
-        <w:t>30</w:t>
-      </w:r>
-      <w:r>
-        <w:t>日；</w:t>
-      </w:r>
-      <w:r>
-        <w:t>172</w:t>
-      </w:r>
-      <w:r>
-        <w:t>校、</w:t>
-      </w:r>
-      <w:r>
-        <w:t>236</w:t>
-      </w:r>
-      <w:r>
-        <w:t>組初賽、</w:t>
-      </w:r>
-      <w:r>
-        <w:t>70</w:t>
-      </w:r>
-      <w:r>
-        <w:t>組決賽及三項故事主題。</w:t>
-      </w:r>
-      <w:r>
-        <w:t xml:space="preserve">https://www.moe.gov.tw/News_Content.aspx?n=9E7AC85F1954DDA8&amp;s=9C06AFB083644471&amp;sms=169B8E91BB75571F </w:t>
-      </w:r>
-      <w:r>
-        <w:t>。查詢日：</w:t>
-      </w:r>
-      <w:r>
-        <w:t>2026</w:t>
-      </w:r>
-      <w:r>
-        <w:t>年</w:t>
-      </w:r>
-      <w:r>
-        <w:t>7</w:t>
-      </w:r>
-      <w:r>
-        <w:t>月</w:t>
-      </w:r>
-      <w:r>
-        <w:t>14</w:t>
-      </w:r>
-      <w:r>
-        <w:t>日。</w:t>
-      </w:r>
-    </w:p>
-    <w:p>
-      <w:pPr>
-        <w:pStyle w:val="HTBody"/>
-      </w:pPr>
-      <w:r>
-        <w:t xml:space="preserve">[16] </w:t>
-      </w:r>
-      <w:r>
-        <w:t>教育部國民及學前教育署。〈新住民子女教育資訊網〉：最新消息、語文教材、文件、相關計畫、課程與活動入口。</w:t>
-      </w:r>
-      <w:r>
-        <w:t xml:space="preserve">https://mkm.k12ea.gov.tw/ </w:t>
-      </w:r>
-      <w:r>
-        <w:t>。查詢日：</w:t>
-      </w:r>
-      <w:r>
-        <w:t>2026</w:t>
-      </w:r>
-      <w:r>
-        <w:t>年</w:t>
-      </w:r>
-      <w:r>
-        <w:t>7</w:t>
-      </w:r>
-      <w:r>
-        <w:t>月</w:t>
-      </w:r>
-      <w:r>
-        <w:t>14</w:t>
-      </w:r>
-      <w:r>
-        <w:t>日。</w:t>
-      </w:r>
-    </w:p>
-    <w:p>
-      <w:pPr>
-        <w:pStyle w:val="HTBody"/>
-      </w:pPr>
-      <w:r>
-        <w:lastRenderedPageBreak/>
-        <w:t xml:space="preserve">[17] </w:t>
-      </w:r>
-      <w:r>
-        <w:t>教育部國民及學前教育署。〈新住民子女教育資訊網－研習活動〉：可依類別、縣市、狀態及日期查詢遠距直播、教學支援、競賽與研習。</w:t>
-      </w:r>
-      <w:r>
-        <w:t xml:space="preserve">https://mkm.k12ea.gov.tw/study </w:t>
-      </w:r>
-      <w:r>
-        <w:t>。查詢日：</w:t>
-      </w:r>
-      <w:r>
-        <w:t>2026</w:t>
-      </w:r>
-      <w:r>
-        <w:t>年</w:t>
-      </w:r>
-      <w:r>
-        <w:t>7</w:t>
-      </w:r>
-      <w:r>
-        <w:t>月</w:t>
-      </w:r>
-      <w:r>
-        <w:t>14</w:t>
-      </w:r>
-      <w:r>
-        <w:t>日。</w:t>
-      </w:r>
-    </w:p>
-    <w:p>
-      <w:pPr>
-        <w:pStyle w:val="HTBody"/>
-      </w:pPr>
-      <w:r>
-        <w:t xml:space="preserve">[18] </w:t>
-      </w:r>
-      <w:r>
-        <w:t>教育部（</w:t>
-      </w:r>
-      <w:r>
-        <w:t>2026</w:t>
-      </w:r>
-      <w:r>
-        <w:t>）。〈重大教育政策發展歷程－新住民教育〉：課綱七語、</w:t>
-      </w:r>
-      <w:r>
-        <w:t>126</w:t>
-      </w:r>
-      <w:r>
-        <w:t>冊教材、遠距直播、新住民學習中心及教育資訊網</w:t>
-      </w:r>
-      <w:r>
-        <w:t>2.0</w:t>
-      </w:r>
-      <w:r>
-        <w:t>。</w:t>
-      </w:r>
-      <w:r>
-        <w:t xml:space="preserve">https://history.moe.gov.tw/Policy/Detail/99bc4e53-3e97-4395-8a76-acfbce2ce7d7 </w:t>
-      </w:r>
-      <w:r>
-        <w:t>。查詢日：</w:t>
-      </w:r>
-      <w:r>
-        <w:t>2026</w:t>
-      </w:r>
-      <w:r>
-        <w:t>年</w:t>
-      </w:r>
-      <w:r>
-        <w:t>7</w:t>
-      </w:r>
-      <w:r>
-        <w:t>月</w:t>
-      </w:r>
-      <w:r>
-        <w:t>14</w:t>
-      </w:r>
-      <w:r>
-        <w:t>日。</w:t>
-      </w:r>
-    </w:p>
-    <w:p>
-      <w:pPr>
-        <w:pStyle w:val="HTBody"/>
-      </w:pPr>
-      <w:r>
-        <w:t xml:space="preserve">[19] </w:t>
-      </w:r>
-      <w:r>
-        <w:t>教育部國民及學前教育署（</w:t>
-      </w:r>
-      <w:r>
-        <w:t>2026</w:t>
-      </w:r>
-      <w:r>
-        <w:t>）。〈</w:t>
-      </w:r>
-      <w:r>
-        <w:t>115</w:t>
-      </w:r>
-      <w:r>
-        <w:t>年全國性多語多元文化繪本親子共讀心得感想甄選活動計畫及海報〉；活動簡章由該公告附檔提供。</w:t>
-      </w:r>
-      <w:r>
-        <w:t xml:space="preserve">https://mkm.k12ea.gov.tw/news/17202605110001 </w:t>
-      </w:r>
-      <w:r>
-        <w:t>。查詢日：</w:t>
-      </w:r>
-      <w:r>
-        <w:t>2026</w:t>
-      </w:r>
-      <w:r>
-        <w:t>年</w:t>
-      </w:r>
-      <w:r>
-        <w:t>7</w:t>
-      </w:r>
-      <w:r>
-        <w:t>月</w:t>
-      </w:r>
-      <w:r>
-        <w:t>14</w:t>
-      </w:r>
-      <w:r>
-        <w:t>日。</w:t>
-      </w:r>
-    </w:p>
-    <w:p>
-      <w:pPr>
-        <w:pStyle w:val="HTH1"/>
-      </w:pPr>
-      <w:bookmarkStart w:id="26" w:name="_Toc234893830"/>
-      <w:r>
-        <w:t>第六章　附件</w:t>
-      </w:r>
-      <w:bookmarkEnd w:id="26"/>
+        <w:t>正式家庭試用前，除法定代理人同意外，還要加入孩子能理解的二次說明、拒絕錄音與撤回路徑。產品不做人聲複製、聲紋辨識、地方口音排名或自動文化正誤判定；原始音檔不作模型訓練，除非錄音者另行明確同意。</w:t>
+      </w:r>
     </w:p>
     <w:p>
       <w:pPr>
         <w:pStyle w:val="HTH2"/>
       </w:pPr>
-      <w:bookmarkStart w:id="27" w:name="_Toc234893831"/>
-      <w:r>
-        <w:t>一、作品檔案與使用說明</w:t>
-      </w:r>
-      <w:bookmarkEnd w:id="27"/>
-    </w:p>
-    <w:p>
-      <w:pPr>
-        <w:pStyle w:val="HTBullet"/>
-      </w:pPr>
-      <w:r>
-        <w:t xml:space="preserve">• </w:t>
-      </w:r>
-      <w:r>
-        <w:t>可直接建置的</w:t>
-      </w:r>
-      <w:r>
-        <w:t>Flutter Web</w:t>
-      </w:r>
-      <w:r>
-        <w:t>原始碼、相對路徑</w:t>
-      </w:r>
-      <w:r>
-        <w:t>release</w:t>
-      </w:r>
-      <w:r>
-        <w:t>與本機啟動／停止腳本。</w:t>
-      </w:r>
-    </w:p>
-    <w:p>
-      <w:pPr>
-        <w:pStyle w:val="HTBullet"/>
-      </w:pPr>
-      <w:r>
-        <w:t xml:space="preserve">• </w:t>
-      </w:r>
-      <w:r>
-        <w:t>最新操作說明、</w:t>
-      </w:r>
-      <w:r>
-        <w:t>Flutter</w:t>
-      </w:r>
-      <w:r>
-        <w:t>完整品質閘門、</w:t>
-      </w:r>
-      <w:r>
-        <w:t>Chromium</w:t>
-      </w:r>
-      <w:r>
-        <w:t>／</w:t>
-      </w:r>
-      <w:r>
-        <w:t>Edge</w:t>
-      </w:r>
-      <w:r>
-        <w:t>操作與</w:t>
-      </w:r>
-      <w:r>
-        <w:t>Pixel 7</w:t>
-      </w:r>
-      <w:r>
-        <w:t>視覺流程、音訊</w:t>
-      </w:r>
-      <w:r>
-        <w:t>manifest</w:t>
-      </w:r>
-      <w:r>
-        <w:t>、插圖來源邊界與技術驗證紀錄。</w:t>
-      </w:r>
-    </w:p>
-    <w:p>
-      <w:pPr>
-        <w:pStyle w:val="HTBullet"/>
-      </w:pPr>
-      <w:r>
-        <w:t xml:space="preserve">• </w:t>
-      </w:r>
-      <w:r>
-        <w:t>本計畫書</w:t>
-      </w:r>
-      <w:r>
-        <w:t>DOCX</w:t>
-      </w:r>
-      <w:r>
-        <w:t>／</w:t>
-      </w:r>
-      <w:r>
-        <w:t>PDF</w:t>
-      </w:r>
-      <w:r>
-        <w:t>、四張由現況資料與真實</w:t>
-      </w:r>
-      <w:r>
-        <w:t>App</w:t>
-      </w:r>
-      <w:r>
-        <w:t>畫面產生的圖表。</w:t>
-      </w:r>
-    </w:p>
-    <w:p>
-      <w:pPr>
-        <w:pStyle w:val="HTBullet"/>
-      </w:pPr>
-      <w:r>
-        <w:t>• 2</w:t>
-      </w:r>
-      <w:r>
-        <w:t>分</w:t>
-      </w:r>
-      <w:r>
-        <w:t>53.9</w:t>
-      </w:r>
-      <w:r>
-        <w:t>秒正式初審</w:t>
-      </w:r>
-      <w:r>
-        <w:t>MP4</w:t>
-      </w:r>
-      <w:r>
-        <w:t>、低於</w:t>
-      </w:r>
-      <w:r>
-        <w:t>25 MiB</w:t>
-      </w:r>
-      <w:r>
-        <w:t>的網頁預覽、分鏡、可重現產生腳本與</w:t>
-      </w:r>
-      <w:r>
-        <w:t>ffprobe</w:t>
-      </w:r>
-      <w:r>
-        <w:t>／</w:t>
-      </w:r>
-      <w:r>
-        <w:t>EBU R128</w:t>
-      </w:r>
-      <w:r>
-        <w:t>驗證</w:t>
-      </w:r>
-      <w:r>
-        <w:t>JSON</w:t>
-      </w:r>
-      <w:r>
-        <w:t>；</w:t>
-      </w:r>
-      <w:r>
-        <w:t>15</w:t>
-      </w:r>
-      <w:r>
-        <w:t>幕旁白及逐段響度均通過門檻。</w:t>
-      </w:r>
-    </w:p>
-    <w:p>
-      <w:pPr>
-        <w:pStyle w:val="HTBullet"/>
-      </w:pPr>
-      <w:r>
-        <w:t xml:space="preserve">• </w:t>
-      </w:r>
-      <w:r>
-        <w:t>新住民家庭匿名問卷與試用方案；尚未回收的結果不列成果。</w:t>
-      </w:r>
-    </w:p>
-    <w:p>
-      <w:pPr>
-        <w:pStyle w:val="HTBullet"/>
-      </w:pPr>
-      <w:r>
-        <w:t>• 119</w:t>
-      </w:r>
-      <w:r>
-        <w:t>句越南語母語審閱工具；可逐檔播放並匯出</w:t>
-      </w:r>
-      <w:r>
-        <w:t>JSON</w:t>
-      </w:r>
-      <w:r>
-        <w:t>／</w:t>
-      </w:r>
-      <w:r>
-        <w:t>CSV</w:t>
-      </w:r>
-      <w:r>
-        <w:t>，但目前空白工具不列真人審閱成果。</w:t>
-      </w:r>
-    </w:p>
-    <w:p>
-      <w:pPr>
-        <w:pStyle w:val="HTH2"/>
-      </w:pPr>
-      <w:bookmarkStart w:id="28" w:name="_Toc234893832"/>
-      <w:r>
-        <w:t>二、資料與兒少保護原則</w:t>
-      </w:r>
-      <w:bookmarkEnd w:id="28"/>
-    </w:p>
-    <w:p>
-      <w:pPr>
-        <w:pStyle w:val="HTBody"/>
-      </w:pPr>
-      <w:r>
-        <w:t>家庭內容預設只限目前裝置與已核准家人。</w:t>
-      </w:r>
-      <w:r>
-        <w:t>Web</w:t>
-      </w:r>
-      <w:r>
-        <w:t>版不要求真實姓名，也不主動把家庭錄音送到團隊伺服器；文字備份不含錄音本體、個別家人碼、邀請私鑰或重試狀態。成人可刪除家庭資料；應用層加密、雲端同步、帳號復原與系統備份控制尚未完成，介面不得把本機原型稱為產品級安全社群。</w:t>
-      </w:r>
-      <w:r>
-        <w:t>[7][8]</w:t>
-      </w:r>
-    </w:p>
-    <w:p>
-      <w:pPr>
-        <w:pStyle w:val="HTBody"/>
-      </w:pPr>
-      <w:r>
-        <w:t>正式家庭試用前，除法定代理人同意外，還要加入孩子能理解的二次說明、拒絕錄音與撤回路徑。產品不做人聲複製、聲紋辨識、地方口音排名或自動文化正誤判定；原始音檔不作模型訓練，除非錄音者另行明確同意。</w:t>
-      </w:r>
-    </w:p>
-    <w:p>
-      <w:pPr>
-        <w:pStyle w:val="HTH2"/>
-      </w:pPr>
-      <w:bookmarkStart w:id="29" w:name="_Toc234893833"/>
-      <w:r>
-        <w:lastRenderedPageBreak/>
+      <w:bookmarkStart w:id="29" w:name="_Toc234900745"/>
+      <w:r>
         <w:t>三、品質與一致性檢查</w:t>
       </w:r>
       <w:bookmarkEnd w:id="29"/>
@@ -7674,7 +7701,7 @@
     <w:autoRedefine/>
     <w:uiPriority w:val="39"/>
     <w:unhideWhenUsed/>
-    <w:rsid w:val="00A845F7"/>
+    <w:rsid w:val="001F7A58"/>
   </w:style>
   <w:style w:type="paragraph" w:styleId="21">
     <w:name w:val="toc 2"/>
@@ -7683,7 +7710,7 @@
     <w:autoRedefine/>
     <w:uiPriority w:val="39"/>
     <w:unhideWhenUsed/>
-    <w:rsid w:val="00A845F7"/>
+    <w:rsid w:val="001F7A58"/>
     <w:pPr>
       <w:ind w:leftChars="200" w:left="480"/>
     </w:pPr>
@@ -7693,7 +7720,7 @@
     <w:basedOn w:val="a0"/>
     <w:uiPriority w:val="99"/>
     <w:unhideWhenUsed/>
-    <w:rsid w:val="00A845F7"/>
+    <w:rsid w:val="001F7A58"/>
     <w:rPr>
       <w:color w:val="0563C1" w:themeColor="hyperlink"/>
       <w:u w:val="single"/>

</xml_diff>